<commit_message>
MAJ des docs documentations
</commit_message>
<xml_diff>
--- a/docs/documentation_technique.docx
+++ b/docs/documentation_technique.docx
@@ -3634,6 +3634,60 @@
         <w:t xml:space="preserve">7. Architecture des classes</w:t>
       </w:r>
     </w:p>
+    <w:p>
+      <w:pPr>
+        <w:spacing w:after="160" w:before="0" w:line="360" w:lineRule="auto"/>
+        <w:jc w:val="both"/>
+      </w:pPr>
+      <w:r>
+        <w:rPr>
+          <w:rFonts w:ascii="Times New Roman" w:cs="Times New Roman" w:eastAsia="Times New Roman" w:hAnsi="Times New Roman"/>
+          <w:b w:val="false"/>
+          <w:bCs w:val="false"/>
+          <w:i w:val="false"/>
+          <w:iCs w:val="false"/>
+          <w:sz w:val="24"/>
+          <w:szCs w:val="24"/>
+        </w:rPr>
+        <w:t xml:space="preserve">L'application suit le modèle d'architecture MVC. Le code est réparti en trois paquets principaux : modele, vue et controleur, plus la classe Main à la racine.</w:t>
+      </w:r>
+    </w:p>
+    <w:p>
+      <w:pPr>
+        <w:spacing w:after="160" w:before="240" w:line="360" w:lineRule="auto"/>
+        <w:jc w:val="both"/>
+      </w:pPr>
+      <w:r>
+        <w:rPr>
+          <w:rFonts w:ascii="Times New Roman" w:cs="Times New Roman" w:eastAsia="Times New Roman" w:hAnsi="Times New Roman"/>
+          <w:b/>
+          <w:bCs/>
+          <w:i w:val="false"/>
+          <w:iCs w:val="false"/>
+          <w:sz w:val="24"/>
+          <w:szCs w:val="24"/>
+        </w:rPr>
+        <w:t xml:space="preserve">Le modèle</w:t>
+      </w:r>
+    </w:p>
+    <w:p>
+      <w:pPr>
+        <w:spacing w:after="160" w:before="0" w:line="360" w:lineRule="auto"/>
+        <w:jc w:val="both"/>
+      </w:pPr>
+      <w:r>
+        <w:rPr>
+          <w:rFonts w:ascii="Times New Roman" w:cs="Times New Roman" w:eastAsia="Times New Roman" w:hAnsi="Times New Roman"/>
+          <w:b w:val="false"/>
+          <w:bCs w:val="false"/>
+          <w:i w:val="false"/>
+          <w:iCs w:val="false"/>
+          <w:sz w:val="24"/>
+          <w:szCs w:val="24"/>
+        </w:rPr>
+        <w:t xml:space="preserve">Il regroupe tout ce qui ne dépend pas de la façon dont l'application est utilisée, et se découpe en quatre sous-paquets.</w:t>
+      </w:r>
+    </w:p>
     <w:tbl>
       <w:tblPr>
         <w:tblW w:type="dxa" w:w="9026"/>
@@ -3729,7 +3783,7 @@
                 <w:sz w:val="24"/>
                 <w:szCs w:val="24"/>
               </w:rPr>
-              <w:t xml:space="preserve">Main</w:t>
+              <w:t xml:space="preserve">Portefeuille</w:t>
             </w:r>
           </w:p>
         </w:tc>
@@ -3755,7 +3809,7 @@
                 <w:sz w:val="24"/>
                 <w:szCs w:val="24"/>
               </w:rPr>
-              <w:t xml:space="preserve">Point d'entrée du programme, lance le menu principal</w:t>
+              <w:t xml:space="preserve">Entité : transactions, catégories actives, objectifs, compteurs d'identifiants</w:t>
             </w:r>
           </w:p>
         </w:tc>
@@ -3783,7 +3837,7 @@
                 <w:sz w:val="24"/>
                 <w:szCs w:val="24"/>
               </w:rPr>
-              <w:t xml:space="preserve">Menu</w:t>
+              <w:t xml:space="preserve">Transaction</w:t>
             </w:r>
           </w:p>
         </w:tc>
@@ -3809,7 +3863,7 @@
                 <w:sz w:val="24"/>
                 <w:szCs w:val="24"/>
               </w:rPr>
-              <w:t xml:space="preserve">Gère l'affichage console et la saisie utilisateur, sans aucune logique métier</w:t>
+              <w:t xml:space="preserve">Entité : représente une dépense ou un revenu</w:t>
             </w:r>
           </w:p>
         </w:tc>
@@ -3837,7 +3891,7 @@
                 <w:sz w:val="24"/>
                 <w:szCs w:val="24"/>
               </w:rPr>
-              <w:t xml:space="preserve">Portefeuille</w:t>
+              <w:t xml:space="preserve">Epargne</w:t>
             </w:r>
           </w:p>
         </w:tc>
@@ -3863,7 +3917,7 @@
                 <w:sz w:val="24"/>
                 <w:szCs w:val="24"/>
               </w:rPr>
-              <w:t xml:space="preserve">Classe centrale : transactions, catégories actives, objectifs, calcul du solde disponible</w:t>
+              <w:t xml:space="preserve">Entité : représente un objectif d'épargne et sa liste de mouvements</w:t>
             </w:r>
           </w:p>
         </w:tc>
@@ -3891,7 +3945,7 @@
                 <w:sz w:val="24"/>
                 <w:szCs w:val="24"/>
               </w:rPr>
-              <w:t xml:space="preserve">Transaction</w:t>
+              <w:t xml:space="preserve">MouvementEpargne</w:t>
             </w:r>
           </w:p>
         </w:tc>
@@ -3917,7 +3971,7 @@
                 <w:sz w:val="24"/>
                 <w:szCs w:val="24"/>
               </w:rPr>
-              <w:t xml:space="preserve">Représente une dépense ou un revenu</w:t>
+              <w:t xml:space="preserve">Entité : représente une contribution ou un retrait, immuable</w:t>
             </w:r>
           </w:p>
         </w:tc>
@@ -4053,7 +4107,7 @@
                 <w:sz w:val="24"/>
                 <w:szCs w:val="24"/>
               </w:rPr>
-              <w:t xml:space="preserve">Epargne</w:t>
+              <w:t xml:space="preserve">SensMouvement</w:t>
             </w:r>
           </w:p>
         </w:tc>
@@ -4079,7 +4133,7 @@
                 <w:sz w:val="24"/>
                 <w:szCs w:val="24"/>
               </w:rPr>
-              <w:t xml:space="preserve">Représente un objectif d'épargne et son historique de mouvements</w:t>
+              <w:t xml:space="preserve">Énumération : CONTRIBUTION, RETRAIT</w:t>
             </w:r>
           </w:p>
         </w:tc>
@@ -4107,7 +4161,7 @@
                 <w:sz w:val="24"/>
                 <w:szCs w:val="24"/>
               </w:rPr>
-              <w:t xml:space="preserve">MouvementEpargne</w:t>
+              <w:t xml:space="preserve">ServicePortefeuille</w:t>
             </w:r>
           </w:p>
         </w:tc>
@@ -4133,7 +4187,7 @@
                 <w:sz w:val="24"/>
                 <w:szCs w:val="24"/>
               </w:rPr>
-              <w:t xml:space="preserve">Représente une contribution ou un retrait sur un objectif</w:t>
+              <w:t xml:space="preserve">Calcul du solde disponible et du total épargné, déclenchement de la sauvegarde ; seul détenteur du portefeuille</w:t>
             </w:r>
           </w:p>
         </w:tc>
@@ -4161,7 +4215,7 @@
                 <w:sz w:val="24"/>
                 <w:szCs w:val="24"/>
               </w:rPr>
-              <w:t xml:space="preserve">SensMouvement</w:t>
+              <w:t xml:space="preserve">ServiceTransaction</w:t>
             </w:r>
           </w:p>
         </w:tc>
@@ -4187,7 +4241,7 @@
                 <w:sz w:val="24"/>
                 <w:szCs w:val="24"/>
               </w:rPr>
-              <w:t xml:space="preserve">Énumération : CONTRIBUTION, RETRAIT</w:t>
+              <w:t xml:space="preserve">Ajout, modification, suppression et filtrage des transactions</w:t>
             </w:r>
           </w:p>
         </w:tc>
@@ -4215,6 +4269,222 @@
                 <w:sz w:val="24"/>
                 <w:szCs w:val="24"/>
               </w:rPr>
+              <w:t xml:space="preserve">ServiceEpargne</w:t>
+            </w:r>
+          </w:p>
+        </w:tc>
+        <w:tc>
+          <w:tcPr>
+            <w:tcW w:type="dxa" w:w="6426"/>
+            <w:tcMar>
+              <w:top w:type="dxa" w:w="100"/>
+              <w:left w:type="dxa" w:w="120"/>
+              <w:bottom w:type="dxa" w:w="100"/>
+              <w:right w:type="dxa" w:w="120"/>
+            </w:tcMar>
+          </w:tcPr>
+          <w:p>
+            <w:pPr>
+              <w:spacing w:after="0" w:line="240" w:lineRule="auto"/>
+            </w:pPr>
+            <w:r>
+              <w:rPr>
+                <w:rFonts w:ascii="Times New Roman" w:cs="Times New Roman" w:eastAsia="Times New Roman" w:hAnsi="Times New Roman"/>
+                <w:b w:val="false"/>
+                <w:bCs w:val="false"/>
+                <w:sz w:val="24"/>
+                <w:szCs w:val="24"/>
+              </w:rPr>
+              <w:t xml:space="preserve">Création, contribution, retrait, suppression et progression des objectifs</w:t>
+            </w:r>
+          </w:p>
+        </w:tc>
+      </w:tr>
+      <w:tr>
+        <w:tc>
+          <w:tcPr>
+            <w:tcW w:type="dxa" w:w="2600"/>
+            <w:tcMar>
+              <w:top w:type="dxa" w:w="100"/>
+              <w:left w:type="dxa" w:w="120"/>
+              <w:bottom w:type="dxa" w:w="100"/>
+              <w:right w:type="dxa" w:w="120"/>
+            </w:tcMar>
+          </w:tcPr>
+          <w:p>
+            <w:pPr>
+              <w:spacing w:after="0" w:line="240" w:lineRule="auto"/>
+            </w:pPr>
+            <w:r>
+              <w:rPr>
+                <w:rFonts w:ascii="Times New Roman" w:cs="Times New Roman" w:eastAsia="Times New Roman" w:hAnsi="Times New Roman"/>
+                <w:b w:val="false"/>
+                <w:bCs w:val="false"/>
+                <w:sz w:val="24"/>
+                <w:szCs w:val="24"/>
+              </w:rPr>
+              <w:t xml:space="preserve">ServiceCategorie</w:t>
+            </w:r>
+          </w:p>
+        </w:tc>
+        <w:tc>
+          <w:tcPr>
+            <w:tcW w:type="dxa" w:w="6426"/>
+            <w:tcMar>
+              <w:top w:type="dxa" w:w="100"/>
+              <w:left w:type="dxa" w:w="120"/>
+              <w:bottom w:type="dxa" w:w="100"/>
+              <w:right w:type="dxa" w:w="120"/>
+            </w:tcMar>
+          </w:tcPr>
+          <w:p>
+            <w:pPr>
+              <w:spacing w:after="0" w:line="240" w:lineRule="auto"/>
+            </w:pPr>
+            <w:r>
+              <w:rPr>
+                <w:rFonts w:ascii="Times New Roman" w:cs="Times New Roman" w:eastAsia="Times New Roman" w:hAnsi="Times New Roman"/>
+                <w:b w:val="false"/>
+                <w:bCs w:val="false"/>
+                <w:sz w:val="24"/>
+                <w:szCs w:val="24"/>
+              </w:rPr>
+              <w:t xml:space="preserve">Activation, désactivation et listes de catégories</w:t>
+            </w:r>
+          </w:p>
+        </w:tc>
+      </w:tr>
+      <w:tr>
+        <w:tc>
+          <w:tcPr>
+            <w:tcW w:type="dxa" w:w="2600"/>
+            <w:tcMar>
+              <w:top w:type="dxa" w:w="100"/>
+              <w:left w:type="dxa" w:w="120"/>
+              <w:bottom w:type="dxa" w:w="100"/>
+              <w:right w:type="dxa" w:w="120"/>
+            </w:tcMar>
+          </w:tcPr>
+          <w:p>
+            <w:pPr>
+              <w:spacing w:after="0" w:line="240" w:lineRule="auto"/>
+            </w:pPr>
+            <w:r>
+              <w:rPr>
+                <w:rFonts w:ascii="Times New Roman" w:cs="Times New Roman" w:eastAsia="Times New Roman" w:hAnsi="Times New Roman"/>
+                <w:b w:val="false"/>
+                <w:bCs w:val="false"/>
+                <w:sz w:val="24"/>
+                <w:szCs w:val="24"/>
+              </w:rPr>
+              <w:t xml:space="preserve">ServiceStatistique</w:t>
+            </w:r>
+          </w:p>
+        </w:tc>
+        <w:tc>
+          <w:tcPr>
+            <w:tcW w:type="dxa" w:w="6426"/>
+            <w:tcMar>
+              <w:top w:type="dxa" w:w="100"/>
+              <w:left w:type="dxa" w:w="120"/>
+              <w:bottom w:type="dxa" w:w="100"/>
+              <w:right w:type="dxa" w:w="120"/>
+            </w:tcMar>
+          </w:tcPr>
+          <w:p>
+            <w:pPr>
+              <w:spacing w:after="0" w:line="240" w:lineRule="auto"/>
+            </w:pPr>
+            <w:r>
+              <w:rPr>
+                <w:rFonts w:ascii="Times New Roman" w:cs="Times New Roman" w:eastAsia="Times New Roman" w:hAnsi="Times New Roman"/>
+                <w:b w:val="false"/>
+                <w:bCs w:val="false"/>
+                <w:sz w:val="24"/>
+                <w:szCs w:val="24"/>
+              </w:rPr>
+              <w:t xml:space="preserve">Totaux par catégorie et comparaison revenus / dépenses</w:t>
+            </w:r>
+          </w:p>
+        </w:tc>
+      </w:tr>
+      <w:tr>
+        <w:tc>
+          <w:tcPr>
+            <w:tcW w:type="dxa" w:w="2600"/>
+            <w:tcMar>
+              <w:top w:type="dxa" w:w="100"/>
+              <w:left w:type="dxa" w:w="120"/>
+              <w:bottom w:type="dxa" w:w="100"/>
+              <w:right w:type="dxa" w:w="120"/>
+            </w:tcMar>
+          </w:tcPr>
+          <w:p>
+            <w:pPr>
+              <w:spacing w:after="0" w:line="240" w:lineRule="auto"/>
+            </w:pPr>
+            <w:r>
+              <w:rPr>
+                <w:rFonts w:ascii="Times New Roman" w:cs="Times New Roman" w:eastAsia="Times New Roman" w:hAnsi="Times New Roman"/>
+                <w:b w:val="false"/>
+                <w:bCs w:val="false"/>
+                <w:sz w:val="24"/>
+                <w:szCs w:val="24"/>
+              </w:rPr>
+              <w:t xml:space="preserve">CalculEpargne</w:t>
+            </w:r>
+          </w:p>
+        </w:tc>
+        <w:tc>
+          <w:tcPr>
+            <w:tcW w:type="dxa" w:w="6426"/>
+            <w:tcMar>
+              <w:top w:type="dxa" w:w="100"/>
+              <w:left w:type="dxa" w:w="120"/>
+              <w:bottom w:type="dxa" w:w="100"/>
+              <w:right w:type="dxa" w:w="120"/>
+            </w:tcMar>
+          </w:tcPr>
+          <w:p>
+            <w:pPr>
+              <w:spacing w:after="0" w:line="240" w:lineRule="auto"/>
+            </w:pPr>
+            <w:r>
+              <w:rPr>
+                <w:rFonts w:ascii="Times New Roman" w:cs="Times New Roman" w:eastAsia="Times New Roman" w:hAnsi="Times New Roman"/>
+                <w:b w:val="false"/>
+                <w:bCs w:val="false"/>
+                <w:sz w:val="24"/>
+                <w:szCs w:val="24"/>
+              </w:rPr>
+              <w:t xml:space="preserve">Classe utilitaire : calcul unique du montant actuel d'un objectif</w:t>
+            </w:r>
+          </w:p>
+        </w:tc>
+      </w:tr>
+      <w:tr>
+        <w:tc>
+          <w:tcPr>
+            <w:tcW w:type="dxa" w:w="2600"/>
+            <w:tcMar>
+              <w:top w:type="dxa" w:w="100"/>
+              <w:left w:type="dxa" w:w="120"/>
+              <w:bottom w:type="dxa" w:w="100"/>
+              <w:right w:type="dxa" w:w="120"/>
+            </w:tcMar>
+          </w:tcPr>
+          <w:p>
+            <w:pPr>
+              <w:spacing w:after="0" w:line="240" w:lineRule="auto"/>
+            </w:pPr>
+            <w:r>
+              <w:rPr>
+                <w:rFonts w:ascii="Times New Roman" w:cs="Times New Roman" w:eastAsia="Times New Roman" w:hAnsi="Times New Roman"/>
+                <w:b w:val="false"/>
+                <w:bCs w:val="false"/>
+                <w:sz w:val="24"/>
+                <w:szCs w:val="24"/>
+              </w:rPr>
               <w:t xml:space="preserve">GestionnaireFichier</w:t>
             </w:r>
           </w:p>
@@ -4241,7 +4511,7 @@
                 <w:sz w:val="24"/>
                 <w:szCs w:val="24"/>
               </w:rPr>
-              <w:t xml:space="preserve">Sauvegarde et chargement du portefeuille au format JSON via Gson</w:t>
+              <w:t xml:space="preserve">Lecture et écriture du fichier JSON via Gson</w:t>
             </w:r>
           </w:p>
         </w:tc>
@@ -4262,12 +4532,427 @@
           <w:sz w:val="24"/>
           <w:szCs w:val="24"/>
         </w:rPr>
-        <w:t xml:space="preserve">Le code est organisé en trois couches. La couche présentation regroupe Main et Menu, la couche métier regroupe Portefeuille, Transaction, Epargne, MouvementEpargne et les énumérations, la couche persistance se limite à GestionnaireFichier et au fichier JSON.</w:t>
-      </w:r>
-    </w:p>
-    <w:p>
-      <w:pPr>
-        <w:spacing w:after="160" w:before="0" w:line="360" w:lineRule="auto"/>
+        <w:t xml:space="preserve">Les entités ne contiennent que leur structure : attributs, constructeurs, getters, setters, et les contrôles de validité portant sur leurs propres champs. Tous les traitements sont dans les services.</w:t>
+      </w:r>
+    </w:p>
+    <w:p>
+      <w:pPr>
+        <w:spacing w:after="160" w:before="240" w:line="360" w:lineRule="auto"/>
+        <w:jc w:val="both"/>
+      </w:pPr>
+      <w:r>
+        <w:rPr>
+          <w:rFonts w:ascii="Times New Roman" w:cs="Times New Roman" w:eastAsia="Times New Roman" w:hAnsi="Times New Roman"/>
+          <w:b/>
+          <w:bCs/>
+          <w:i w:val="false"/>
+          <w:iCs w:val="false"/>
+          <w:sz w:val="24"/>
+          <w:szCs w:val="24"/>
+        </w:rPr>
+        <w:t xml:space="preserve">La vue</w:t>
+      </w:r>
+    </w:p>
+    <w:tbl>
+      <w:tblPr>
+        <w:tblW w:type="dxa" w:w="9026"/>
+        <w:tblBorders>
+          <w:top w:val="single" w:color="auto" w:sz="4"/>
+          <w:left w:val="single" w:color="auto" w:sz="4"/>
+          <w:bottom w:val="single" w:color="auto" w:sz="4"/>
+          <w:right w:val="single" w:color="auto" w:sz="4"/>
+          <w:insideH w:val="single" w:color="auto" w:sz="4"/>
+          <w:insideV w:val="single" w:color="auto" w:sz="4"/>
+        </w:tblBorders>
+      </w:tblPr>
+      <w:tblGrid>
+        <w:gridCol w:w="2600"/>
+        <w:gridCol w:w="6426"/>
+      </w:tblGrid>
+      <w:tr>
+        <w:tc>
+          <w:tcPr>
+            <w:tcW w:type="dxa" w:w="2600"/>
+            <w:shd w:fill="D9D9D9" w:color="auto" w:val="clear"/>
+            <w:tcMar>
+              <w:top w:type="dxa" w:w="100"/>
+              <w:left w:type="dxa" w:w="120"/>
+              <w:bottom w:type="dxa" w:w="100"/>
+              <w:right w:type="dxa" w:w="120"/>
+            </w:tcMar>
+          </w:tcPr>
+          <w:p>
+            <w:pPr>
+              <w:spacing w:after="0" w:line="240" w:lineRule="auto"/>
+            </w:pPr>
+            <w:r>
+              <w:rPr>
+                <w:rFonts w:ascii="Times New Roman" w:cs="Times New Roman" w:eastAsia="Times New Roman" w:hAnsi="Times New Roman"/>
+                <w:b/>
+                <w:bCs/>
+                <w:sz w:val="24"/>
+                <w:szCs w:val="24"/>
+              </w:rPr>
+              <w:t xml:space="preserve">Classe</w:t>
+            </w:r>
+          </w:p>
+        </w:tc>
+        <w:tc>
+          <w:tcPr>
+            <w:tcW w:type="dxa" w:w="6426"/>
+            <w:shd w:fill="D9D9D9" w:color="auto" w:val="clear"/>
+            <w:tcMar>
+              <w:top w:type="dxa" w:w="100"/>
+              <w:left w:type="dxa" w:w="120"/>
+              <w:bottom w:type="dxa" w:w="100"/>
+              <w:right w:type="dxa" w:w="120"/>
+            </w:tcMar>
+          </w:tcPr>
+          <w:p>
+            <w:pPr>
+              <w:spacing w:after="0" w:line="240" w:lineRule="auto"/>
+            </w:pPr>
+            <w:r>
+              <w:rPr>
+                <w:rFonts w:ascii="Times New Roman" w:cs="Times New Roman" w:eastAsia="Times New Roman" w:hAnsi="Times New Roman"/>
+                <w:b/>
+                <w:bCs/>
+                <w:sz w:val="24"/>
+                <w:szCs w:val="24"/>
+              </w:rPr>
+              <w:t xml:space="preserve">Rôle</w:t>
+            </w:r>
+          </w:p>
+        </w:tc>
+      </w:tr>
+      <w:tr>
+        <w:tc>
+          <w:tcPr>
+            <w:tcW w:type="dxa" w:w="2600"/>
+            <w:tcMar>
+              <w:top w:type="dxa" w:w="100"/>
+              <w:left w:type="dxa" w:w="120"/>
+              <w:bottom w:type="dxa" w:w="100"/>
+              <w:right w:type="dxa" w:w="120"/>
+            </w:tcMar>
+          </w:tcPr>
+          <w:p>
+            <w:pPr>
+              <w:spacing w:after="0" w:line="240" w:lineRule="auto"/>
+            </w:pPr>
+            <w:r>
+              <w:rPr>
+                <w:rFonts w:ascii="Times New Roman" w:cs="Times New Roman" w:eastAsia="Times New Roman" w:hAnsi="Times New Roman"/>
+                <w:b w:val="false"/>
+                <w:bCs w:val="false"/>
+                <w:sz w:val="24"/>
+                <w:szCs w:val="24"/>
+              </w:rPr>
+              <w:t xml:space="preserve">VueConsole</w:t>
+            </w:r>
+          </w:p>
+        </w:tc>
+        <w:tc>
+          <w:tcPr>
+            <w:tcW w:type="dxa" w:w="6426"/>
+            <w:tcMar>
+              <w:top w:type="dxa" w:w="100"/>
+              <w:left w:type="dxa" w:w="120"/>
+              <w:bottom w:type="dxa" w:w="100"/>
+              <w:right w:type="dxa" w:w="120"/>
+            </w:tcMar>
+          </w:tcPr>
+          <w:p>
+            <w:pPr>
+              <w:spacing w:after="0" w:line="240" w:lineRule="auto"/>
+            </w:pPr>
+            <w:r>
+              <w:rPr>
+                <w:rFonts w:ascii="Times New Roman" w:cs="Times New Roman" w:eastAsia="Times New Roman" w:hAnsi="Times New Roman"/>
+                <w:b w:val="false"/>
+                <w:bCs w:val="false"/>
+                <w:sz w:val="24"/>
+                <w:szCs w:val="24"/>
+              </w:rPr>
+              <w:t xml:space="preserve">Briques réutilisées partout : lecture d'une ligne, d'un entier, d'un montant, d'une date, confirmation, affichage d'un message ou d'une erreur</w:t>
+            </w:r>
+          </w:p>
+        </w:tc>
+      </w:tr>
+      <w:tr>
+        <w:tc>
+          <w:tcPr>
+            <w:tcW w:type="dxa" w:w="2600"/>
+            <w:tcMar>
+              <w:top w:type="dxa" w:w="100"/>
+              <w:left w:type="dxa" w:w="120"/>
+              <w:bottom w:type="dxa" w:w="100"/>
+              <w:right w:type="dxa" w:w="120"/>
+            </w:tcMar>
+          </w:tcPr>
+          <w:p>
+            <w:pPr>
+              <w:spacing w:after="0" w:line="240" w:lineRule="auto"/>
+            </w:pPr>
+            <w:r>
+              <w:rPr>
+                <w:rFonts w:ascii="Times New Roman" w:cs="Times New Roman" w:eastAsia="Times New Roman" w:hAnsi="Times New Roman"/>
+                <w:b w:val="false"/>
+                <w:bCs w:val="false"/>
+                <w:sz w:val="24"/>
+                <w:szCs w:val="24"/>
+              </w:rPr>
+              <w:t xml:space="preserve">VuePrincipale</w:t>
+            </w:r>
+          </w:p>
+        </w:tc>
+        <w:tc>
+          <w:tcPr>
+            <w:tcW w:type="dxa" w:w="6426"/>
+            <w:tcMar>
+              <w:top w:type="dxa" w:w="100"/>
+              <w:left w:type="dxa" w:w="120"/>
+              <w:bottom w:type="dxa" w:w="100"/>
+              <w:right w:type="dxa" w:w="120"/>
+            </w:tcMar>
+          </w:tcPr>
+          <w:p>
+            <w:pPr>
+              <w:spacing w:after="0" w:line="240" w:lineRule="auto"/>
+            </w:pPr>
+            <w:r>
+              <w:rPr>
+                <w:rFonts w:ascii="Times New Roman" w:cs="Times New Roman" w:eastAsia="Times New Roman" w:hAnsi="Times New Roman"/>
+                <w:b w:val="false"/>
+                <w:bCs w:val="false"/>
+                <w:sz w:val="24"/>
+                <w:szCs w:val="24"/>
+              </w:rPr>
+              <w:t xml:space="preserve">Menu principal et affichage du solde</w:t>
+            </w:r>
+          </w:p>
+        </w:tc>
+      </w:tr>
+      <w:tr>
+        <w:tc>
+          <w:tcPr>
+            <w:tcW w:type="dxa" w:w="2600"/>
+            <w:tcMar>
+              <w:top w:type="dxa" w:w="100"/>
+              <w:left w:type="dxa" w:w="120"/>
+              <w:bottom w:type="dxa" w:w="100"/>
+              <w:right w:type="dxa" w:w="120"/>
+            </w:tcMar>
+          </w:tcPr>
+          <w:p>
+            <w:pPr>
+              <w:spacing w:after="0" w:line="240" w:lineRule="auto"/>
+            </w:pPr>
+            <w:r>
+              <w:rPr>
+                <w:rFonts w:ascii="Times New Roman" w:cs="Times New Roman" w:eastAsia="Times New Roman" w:hAnsi="Times New Roman"/>
+                <w:b w:val="false"/>
+                <w:bCs w:val="false"/>
+                <w:sz w:val="24"/>
+                <w:szCs w:val="24"/>
+              </w:rPr>
+              <w:t xml:space="preserve">VueTransaction</w:t>
+            </w:r>
+          </w:p>
+        </w:tc>
+        <w:tc>
+          <w:tcPr>
+            <w:tcW w:type="dxa" w:w="6426"/>
+            <w:tcMar>
+              <w:top w:type="dxa" w:w="100"/>
+              <w:left w:type="dxa" w:w="120"/>
+              <w:bottom w:type="dxa" w:w="100"/>
+              <w:right w:type="dxa" w:w="120"/>
+            </w:tcMar>
+          </w:tcPr>
+          <w:p>
+            <w:pPr>
+              <w:spacing w:after="0" w:line="240" w:lineRule="auto"/>
+            </w:pPr>
+            <w:r>
+              <w:rPr>
+                <w:rFonts w:ascii="Times New Roman" w:cs="Times New Roman" w:eastAsia="Times New Roman" w:hAnsi="Times New Roman"/>
+                <w:b w:val="false"/>
+                <w:bCs w:val="false"/>
+                <w:sz w:val="24"/>
+                <w:szCs w:val="24"/>
+              </w:rPr>
+              <w:t xml:space="preserve">Écrans de saisie, d'historique, de modification et de suppression</w:t>
+            </w:r>
+          </w:p>
+        </w:tc>
+      </w:tr>
+      <w:tr>
+        <w:tc>
+          <w:tcPr>
+            <w:tcW w:type="dxa" w:w="2600"/>
+            <w:tcMar>
+              <w:top w:type="dxa" w:w="100"/>
+              <w:left w:type="dxa" w:w="120"/>
+              <w:bottom w:type="dxa" w:w="100"/>
+              <w:right w:type="dxa" w:w="120"/>
+            </w:tcMar>
+          </w:tcPr>
+          <w:p>
+            <w:pPr>
+              <w:spacing w:after="0" w:line="240" w:lineRule="auto"/>
+            </w:pPr>
+            <w:r>
+              <w:rPr>
+                <w:rFonts w:ascii="Times New Roman" w:cs="Times New Roman" w:eastAsia="Times New Roman" w:hAnsi="Times New Roman"/>
+                <w:b w:val="false"/>
+                <w:bCs w:val="false"/>
+                <w:sz w:val="24"/>
+                <w:szCs w:val="24"/>
+              </w:rPr>
+              <w:t xml:space="preserve">VueEpargne</w:t>
+            </w:r>
+          </w:p>
+        </w:tc>
+        <w:tc>
+          <w:tcPr>
+            <w:tcW w:type="dxa" w:w="6426"/>
+            <w:tcMar>
+              <w:top w:type="dxa" w:w="100"/>
+              <w:left w:type="dxa" w:w="120"/>
+              <w:bottom w:type="dxa" w:w="100"/>
+              <w:right w:type="dxa" w:w="120"/>
+            </w:tcMar>
+          </w:tcPr>
+          <w:p>
+            <w:pPr>
+              <w:spacing w:after="0" w:line="240" w:lineRule="auto"/>
+            </w:pPr>
+            <w:r>
+              <w:rPr>
+                <w:rFonts w:ascii="Times New Roman" w:cs="Times New Roman" w:eastAsia="Times New Roman" w:hAnsi="Times New Roman"/>
+                <w:b w:val="false"/>
+                <w:bCs w:val="false"/>
+                <w:sz w:val="24"/>
+                <w:szCs w:val="24"/>
+              </w:rPr>
+              <w:t xml:space="preserve">Écrans de gestion des objectifs d'épargne</w:t>
+            </w:r>
+          </w:p>
+        </w:tc>
+      </w:tr>
+      <w:tr>
+        <w:tc>
+          <w:tcPr>
+            <w:tcW w:type="dxa" w:w="2600"/>
+            <w:tcMar>
+              <w:top w:type="dxa" w:w="100"/>
+              <w:left w:type="dxa" w:w="120"/>
+              <w:bottom w:type="dxa" w:w="100"/>
+              <w:right w:type="dxa" w:w="120"/>
+            </w:tcMar>
+          </w:tcPr>
+          <w:p>
+            <w:pPr>
+              <w:spacing w:after="0" w:line="240" w:lineRule="auto"/>
+            </w:pPr>
+            <w:r>
+              <w:rPr>
+                <w:rFonts w:ascii="Times New Roman" w:cs="Times New Roman" w:eastAsia="Times New Roman" w:hAnsi="Times New Roman"/>
+                <w:b w:val="false"/>
+                <w:bCs w:val="false"/>
+                <w:sz w:val="24"/>
+                <w:szCs w:val="24"/>
+              </w:rPr>
+              <w:t xml:space="preserve">VueCategorie</w:t>
+            </w:r>
+          </w:p>
+        </w:tc>
+        <w:tc>
+          <w:tcPr>
+            <w:tcW w:type="dxa" w:w="6426"/>
+            <w:tcMar>
+              <w:top w:type="dxa" w:w="100"/>
+              <w:left w:type="dxa" w:w="120"/>
+              <w:bottom w:type="dxa" w:w="100"/>
+              <w:right w:type="dxa" w:w="120"/>
+            </w:tcMar>
+          </w:tcPr>
+          <w:p>
+            <w:pPr>
+              <w:spacing w:after="0" w:line="240" w:lineRule="auto"/>
+            </w:pPr>
+            <w:r>
+              <w:rPr>
+                <w:rFonts w:ascii="Times New Roman" w:cs="Times New Roman" w:eastAsia="Times New Roman" w:hAnsi="Times New Roman"/>
+                <w:b w:val="false"/>
+                <w:bCs w:val="false"/>
+                <w:sz w:val="24"/>
+                <w:szCs w:val="24"/>
+              </w:rPr>
+              <w:t xml:space="preserve">Écrans d'activation et de désactivation des catégories</w:t>
+            </w:r>
+          </w:p>
+        </w:tc>
+      </w:tr>
+      <w:tr>
+        <w:tc>
+          <w:tcPr>
+            <w:tcW w:type="dxa" w:w="2600"/>
+            <w:tcMar>
+              <w:top w:type="dxa" w:w="100"/>
+              <w:left w:type="dxa" w:w="120"/>
+              <w:bottom w:type="dxa" w:w="100"/>
+              <w:right w:type="dxa" w:w="120"/>
+            </w:tcMar>
+          </w:tcPr>
+          <w:p>
+            <w:pPr>
+              <w:spacing w:after="0" w:line="240" w:lineRule="auto"/>
+            </w:pPr>
+            <w:r>
+              <w:rPr>
+                <w:rFonts w:ascii="Times New Roman" w:cs="Times New Roman" w:eastAsia="Times New Roman" w:hAnsi="Times New Roman"/>
+                <w:b w:val="false"/>
+                <w:bCs w:val="false"/>
+                <w:sz w:val="24"/>
+                <w:szCs w:val="24"/>
+              </w:rPr>
+              <w:t xml:space="preserve">VueStatistique</w:t>
+            </w:r>
+          </w:p>
+        </w:tc>
+        <w:tc>
+          <w:tcPr>
+            <w:tcW w:type="dxa" w:w="6426"/>
+            <w:tcMar>
+              <w:top w:type="dxa" w:w="100"/>
+              <w:left w:type="dxa" w:w="120"/>
+              <w:bottom w:type="dxa" w:w="100"/>
+              <w:right w:type="dxa" w:w="120"/>
+            </w:tcMar>
+          </w:tcPr>
+          <w:p>
+            <w:pPr>
+              <w:spacing w:after="0" w:line="240" w:lineRule="auto"/>
+            </w:pPr>
+            <w:r>
+              <w:rPr>
+                <w:rFonts w:ascii="Times New Roman" w:cs="Times New Roman" w:eastAsia="Times New Roman" w:hAnsi="Times New Roman"/>
+                <w:b w:val="false"/>
+                <w:bCs w:val="false"/>
+                <w:sz w:val="24"/>
+                <w:szCs w:val="24"/>
+              </w:rPr>
+              <w:t xml:space="preserve">Affichage des statistiques</w:t>
+            </w:r>
+          </w:p>
+        </w:tc>
+      </w:tr>
+    </w:tbl>
+    <w:p>
+      <w:pPr>
+        <w:spacing w:after="160" w:before="240" w:line="360" w:lineRule="auto"/>
         <w:jc w:val="both"/>
       </w:pPr>
       <w:r>
@@ -4280,7 +4965,517 @@
           <w:sz w:val="24"/>
           <w:szCs w:val="24"/>
         </w:rPr>
-        <w:t xml:space="preserve">Les dépendances vont toujours du haut vers le bas : la couche métier ne connaît pas l'existence de la console. C'est ce qui permettra de remplacer l'interface console par une interface graphique sans réécrire la logique. La sauvegarde est déclenchée par le portefeuille lui-même après chaque opération validée, et non par le menu, afin qu'aucune modification ne puisse être oubliée.</w:t>
+        <w:t xml:space="preserve">Une vue affiche et lit les saisies, rien de plus. Elle ne calcule rien, ne décide de rien, et n'appelle aucun service.</w:t>
+      </w:r>
+    </w:p>
+    <w:p>
+      <w:pPr>
+        <w:spacing w:after="160" w:before="240" w:line="360" w:lineRule="auto"/>
+        <w:jc w:val="both"/>
+      </w:pPr>
+      <w:r>
+        <w:rPr>
+          <w:rFonts w:ascii="Times New Roman" w:cs="Times New Roman" w:eastAsia="Times New Roman" w:hAnsi="Times New Roman"/>
+          <w:b/>
+          <w:bCs/>
+          <w:i w:val="false"/>
+          <w:iCs w:val="false"/>
+          <w:sz w:val="24"/>
+          <w:szCs w:val="24"/>
+        </w:rPr>
+        <w:t xml:space="preserve">Le contrôleur</w:t>
+      </w:r>
+    </w:p>
+    <w:tbl>
+      <w:tblPr>
+        <w:tblW w:type="dxa" w:w="9026"/>
+        <w:tblBorders>
+          <w:top w:val="single" w:color="auto" w:sz="4"/>
+          <w:left w:val="single" w:color="auto" w:sz="4"/>
+          <w:bottom w:val="single" w:color="auto" w:sz="4"/>
+          <w:right w:val="single" w:color="auto" w:sz="4"/>
+          <w:insideH w:val="single" w:color="auto" w:sz="4"/>
+          <w:insideV w:val="single" w:color="auto" w:sz="4"/>
+        </w:tblBorders>
+      </w:tblPr>
+      <w:tblGrid>
+        <w:gridCol w:w="2600"/>
+        <w:gridCol w:w="6426"/>
+      </w:tblGrid>
+      <w:tr>
+        <w:tc>
+          <w:tcPr>
+            <w:tcW w:type="dxa" w:w="2600"/>
+            <w:shd w:fill="D9D9D9" w:color="auto" w:val="clear"/>
+            <w:tcMar>
+              <w:top w:type="dxa" w:w="100"/>
+              <w:left w:type="dxa" w:w="120"/>
+              <w:bottom w:type="dxa" w:w="100"/>
+              <w:right w:type="dxa" w:w="120"/>
+            </w:tcMar>
+          </w:tcPr>
+          <w:p>
+            <w:pPr>
+              <w:spacing w:after="0" w:line="240" w:lineRule="auto"/>
+            </w:pPr>
+            <w:r>
+              <w:rPr>
+                <w:rFonts w:ascii="Times New Roman" w:cs="Times New Roman" w:eastAsia="Times New Roman" w:hAnsi="Times New Roman"/>
+                <w:b/>
+                <w:bCs/>
+                <w:sz w:val="24"/>
+                <w:szCs w:val="24"/>
+              </w:rPr>
+              <w:t xml:space="preserve">Classe</w:t>
+            </w:r>
+          </w:p>
+        </w:tc>
+        <w:tc>
+          <w:tcPr>
+            <w:tcW w:type="dxa" w:w="6426"/>
+            <w:shd w:fill="D9D9D9" w:color="auto" w:val="clear"/>
+            <w:tcMar>
+              <w:top w:type="dxa" w:w="100"/>
+              <w:left w:type="dxa" w:w="120"/>
+              <w:bottom w:type="dxa" w:w="100"/>
+              <w:right w:type="dxa" w:w="120"/>
+            </w:tcMar>
+          </w:tcPr>
+          <w:p>
+            <w:pPr>
+              <w:spacing w:after="0" w:line="240" w:lineRule="auto"/>
+            </w:pPr>
+            <w:r>
+              <w:rPr>
+                <w:rFonts w:ascii="Times New Roman" w:cs="Times New Roman" w:eastAsia="Times New Roman" w:hAnsi="Times New Roman"/>
+                <w:b/>
+                <w:bCs/>
+                <w:sz w:val="24"/>
+                <w:szCs w:val="24"/>
+              </w:rPr>
+              <w:t xml:space="preserve">Rôle</w:t>
+            </w:r>
+          </w:p>
+        </w:tc>
+      </w:tr>
+      <w:tr>
+        <w:tc>
+          <w:tcPr>
+            <w:tcW w:type="dxa" w:w="2600"/>
+            <w:tcMar>
+              <w:top w:type="dxa" w:w="100"/>
+              <w:left w:type="dxa" w:w="120"/>
+              <w:bottom w:type="dxa" w:w="100"/>
+              <w:right w:type="dxa" w:w="120"/>
+            </w:tcMar>
+          </w:tcPr>
+          <w:p>
+            <w:pPr>
+              <w:spacing w:after="0" w:line="240" w:lineRule="auto"/>
+            </w:pPr>
+            <w:r>
+              <w:rPr>
+                <w:rFonts w:ascii="Times New Roman" w:cs="Times New Roman" w:eastAsia="Times New Roman" w:hAnsi="Times New Roman"/>
+                <w:b w:val="false"/>
+                <w:bCs w:val="false"/>
+                <w:sz w:val="24"/>
+                <w:szCs w:val="24"/>
+              </w:rPr>
+              <w:t xml:space="preserve">ControleurPrincipal</w:t>
+            </w:r>
+          </w:p>
+        </w:tc>
+        <w:tc>
+          <w:tcPr>
+            <w:tcW w:type="dxa" w:w="6426"/>
+            <w:tcMar>
+              <w:top w:type="dxa" w:w="100"/>
+              <w:left w:type="dxa" w:w="120"/>
+              <w:bottom w:type="dxa" w:w="100"/>
+              <w:right w:type="dxa" w:w="120"/>
+            </w:tcMar>
+          </w:tcPr>
+          <w:p>
+            <w:pPr>
+              <w:spacing w:after="0" w:line="240" w:lineRule="auto"/>
+            </w:pPr>
+            <w:r>
+              <w:rPr>
+                <w:rFonts w:ascii="Times New Roman" w:cs="Times New Roman" w:eastAsia="Times New Roman" w:hAnsi="Times New Roman"/>
+                <w:b w:val="false"/>
+                <w:bCs w:val="false"/>
+                <w:sz w:val="24"/>
+                <w:szCs w:val="24"/>
+              </w:rPr>
+              <w:t xml:space="preserve">Boucle du menu principal et aiguillage vers les autres contrôleurs</w:t>
+            </w:r>
+          </w:p>
+        </w:tc>
+      </w:tr>
+      <w:tr>
+        <w:tc>
+          <w:tcPr>
+            <w:tcW w:type="dxa" w:w="2600"/>
+            <w:tcMar>
+              <w:top w:type="dxa" w:w="100"/>
+              <w:left w:type="dxa" w:w="120"/>
+              <w:bottom w:type="dxa" w:w="100"/>
+              <w:right w:type="dxa" w:w="120"/>
+            </w:tcMar>
+          </w:tcPr>
+          <w:p>
+            <w:pPr>
+              <w:spacing w:after="0" w:line="240" w:lineRule="auto"/>
+            </w:pPr>
+            <w:r>
+              <w:rPr>
+                <w:rFonts w:ascii="Times New Roman" w:cs="Times New Roman" w:eastAsia="Times New Roman" w:hAnsi="Times New Roman"/>
+                <w:b w:val="false"/>
+                <w:bCs w:val="false"/>
+                <w:sz w:val="24"/>
+                <w:szCs w:val="24"/>
+              </w:rPr>
+              <w:t xml:space="preserve">ControleurTransaction</w:t>
+            </w:r>
+          </w:p>
+        </w:tc>
+        <w:tc>
+          <w:tcPr>
+            <w:tcW w:type="dxa" w:w="6426"/>
+            <w:tcMar>
+              <w:top w:type="dxa" w:w="100"/>
+              <w:left w:type="dxa" w:w="120"/>
+              <w:bottom w:type="dxa" w:w="100"/>
+              <w:right w:type="dxa" w:w="120"/>
+            </w:tcMar>
+          </w:tcPr>
+          <w:p>
+            <w:pPr>
+              <w:spacing w:after="0" w:line="240" w:lineRule="auto"/>
+            </w:pPr>
+            <w:r>
+              <w:rPr>
+                <w:rFonts w:ascii="Times New Roman" w:cs="Times New Roman" w:eastAsia="Times New Roman" w:hAnsi="Times New Roman"/>
+                <w:b w:val="false"/>
+                <w:bCs w:val="false"/>
+                <w:sz w:val="24"/>
+                <w:szCs w:val="24"/>
+              </w:rPr>
+              <w:t xml:space="preserve">Enchaînement des écrans de dépense, de revenu et d'historique</w:t>
+            </w:r>
+          </w:p>
+        </w:tc>
+      </w:tr>
+      <w:tr>
+        <w:tc>
+          <w:tcPr>
+            <w:tcW w:type="dxa" w:w="2600"/>
+            <w:tcMar>
+              <w:top w:type="dxa" w:w="100"/>
+              <w:left w:type="dxa" w:w="120"/>
+              <w:bottom w:type="dxa" w:w="100"/>
+              <w:right w:type="dxa" w:w="120"/>
+            </w:tcMar>
+          </w:tcPr>
+          <w:p>
+            <w:pPr>
+              <w:spacing w:after="0" w:line="240" w:lineRule="auto"/>
+            </w:pPr>
+            <w:r>
+              <w:rPr>
+                <w:rFonts w:ascii="Times New Roman" w:cs="Times New Roman" w:eastAsia="Times New Roman" w:hAnsi="Times New Roman"/>
+                <w:b w:val="false"/>
+                <w:bCs w:val="false"/>
+                <w:sz w:val="24"/>
+                <w:szCs w:val="24"/>
+              </w:rPr>
+              <w:t xml:space="preserve">ControleurEpargne</w:t>
+            </w:r>
+          </w:p>
+        </w:tc>
+        <w:tc>
+          <w:tcPr>
+            <w:tcW w:type="dxa" w:w="6426"/>
+            <w:tcMar>
+              <w:top w:type="dxa" w:w="100"/>
+              <w:left w:type="dxa" w:w="120"/>
+              <w:bottom w:type="dxa" w:w="100"/>
+              <w:right w:type="dxa" w:w="120"/>
+            </w:tcMar>
+          </w:tcPr>
+          <w:p>
+            <w:pPr>
+              <w:spacing w:after="0" w:line="240" w:lineRule="auto"/>
+            </w:pPr>
+            <w:r>
+              <w:rPr>
+                <w:rFonts w:ascii="Times New Roman" w:cs="Times New Roman" w:eastAsia="Times New Roman" w:hAnsi="Times New Roman"/>
+                <w:b w:val="false"/>
+                <w:bCs w:val="false"/>
+                <w:sz w:val="24"/>
+                <w:szCs w:val="24"/>
+              </w:rPr>
+              <w:t xml:space="preserve">Enchaînement des écrans d'objectifs d'épargne</w:t>
+            </w:r>
+          </w:p>
+        </w:tc>
+      </w:tr>
+      <w:tr>
+        <w:tc>
+          <w:tcPr>
+            <w:tcW w:type="dxa" w:w="2600"/>
+            <w:tcMar>
+              <w:top w:type="dxa" w:w="100"/>
+              <w:left w:type="dxa" w:w="120"/>
+              <w:bottom w:type="dxa" w:w="100"/>
+              <w:right w:type="dxa" w:w="120"/>
+            </w:tcMar>
+          </w:tcPr>
+          <w:p>
+            <w:pPr>
+              <w:spacing w:after="0" w:line="240" w:lineRule="auto"/>
+            </w:pPr>
+            <w:r>
+              <w:rPr>
+                <w:rFonts w:ascii="Times New Roman" w:cs="Times New Roman" w:eastAsia="Times New Roman" w:hAnsi="Times New Roman"/>
+                <w:b w:val="false"/>
+                <w:bCs w:val="false"/>
+                <w:sz w:val="24"/>
+                <w:szCs w:val="24"/>
+              </w:rPr>
+              <w:t xml:space="preserve">ControleurCategorie</w:t>
+            </w:r>
+          </w:p>
+        </w:tc>
+        <w:tc>
+          <w:tcPr>
+            <w:tcW w:type="dxa" w:w="6426"/>
+            <w:tcMar>
+              <w:top w:type="dxa" w:w="100"/>
+              <w:left w:type="dxa" w:w="120"/>
+              <w:bottom w:type="dxa" w:w="100"/>
+              <w:right w:type="dxa" w:w="120"/>
+            </w:tcMar>
+          </w:tcPr>
+          <w:p>
+            <w:pPr>
+              <w:spacing w:after="0" w:line="240" w:lineRule="auto"/>
+            </w:pPr>
+            <w:r>
+              <w:rPr>
+                <w:rFonts w:ascii="Times New Roman" w:cs="Times New Roman" w:eastAsia="Times New Roman" w:hAnsi="Times New Roman"/>
+                <w:b w:val="false"/>
+                <w:bCs w:val="false"/>
+                <w:sz w:val="24"/>
+                <w:szCs w:val="24"/>
+              </w:rPr>
+              <w:t xml:space="preserve">Enchaînement des écrans de catégories</w:t>
+            </w:r>
+          </w:p>
+        </w:tc>
+      </w:tr>
+      <w:tr>
+        <w:tc>
+          <w:tcPr>
+            <w:tcW w:type="dxa" w:w="2600"/>
+            <w:tcMar>
+              <w:top w:type="dxa" w:w="100"/>
+              <w:left w:type="dxa" w:w="120"/>
+              <w:bottom w:type="dxa" w:w="100"/>
+              <w:right w:type="dxa" w:w="120"/>
+            </w:tcMar>
+          </w:tcPr>
+          <w:p>
+            <w:pPr>
+              <w:spacing w:after="0" w:line="240" w:lineRule="auto"/>
+            </w:pPr>
+            <w:r>
+              <w:rPr>
+                <w:rFonts w:ascii="Times New Roman" w:cs="Times New Roman" w:eastAsia="Times New Roman" w:hAnsi="Times New Roman"/>
+                <w:b w:val="false"/>
+                <w:bCs w:val="false"/>
+                <w:sz w:val="24"/>
+                <w:szCs w:val="24"/>
+              </w:rPr>
+              <w:t xml:space="preserve">ControleurStatistique</w:t>
+            </w:r>
+          </w:p>
+        </w:tc>
+        <w:tc>
+          <w:tcPr>
+            <w:tcW w:type="dxa" w:w="6426"/>
+            <w:tcMar>
+              <w:top w:type="dxa" w:w="100"/>
+              <w:left w:type="dxa" w:w="120"/>
+              <w:bottom w:type="dxa" w:w="100"/>
+              <w:right w:type="dxa" w:w="120"/>
+            </w:tcMar>
+          </w:tcPr>
+          <w:p>
+            <w:pPr>
+              <w:spacing w:after="0" w:line="240" w:lineRule="auto"/>
+            </w:pPr>
+            <w:r>
+              <w:rPr>
+                <w:rFonts w:ascii="Times New Roman" w:cs="Times New Roman" w:eastAsia="Times New Roman" w:hAnsi="Times New Roman"/>
+                <w:b w:val="false"/>
+                <w:bCs w:val="false"/>
+                <w:sz w:val="24"/>
+                <w:szCs w:val="24"/>
+              </w:rPr>
+              <w:t xml:space="preserve">Enchaînement de l'écran de statistiques</w:t>
+            </w:r>
+          </w:p>
+        </w:tc>
+      </w:tr>
+    </w:tbl>
+    <w:p>
+      <w:pPr>
+        <w:spacing w:after="160" w:before="240" w:line="360" w:lineRule="auto"/>
+        <w:jc w:val="both"/>
+      </w:pPr>
+      <w:r>
+        <w:rPr>
+          <w:rFonts w:ascii="Times New Roman" w:cs="Times New Roman" w:eastAsia="Times New Roman" w:hAnsi="Times New Roman"/>
+          <w:b w:val="false"/>
+          <w:bCs w:val="false"/>
+          <w:i w:val="false"/>
+          <w:iCs w:val="false"/>
+          <w:sz w:val="24"/>
+          <w:szCs w:val="24"/>
+        </w:rPr>
+        <w:t xml:space="preserve">Un contrôleur demande une saisie à la vue, appelle le service concerné, récupère le résultat et le transmet à la vue. Il ne contient aucune règle métier, et aucune chaîne de caractères destinée à l'utilisateur.</w:t>
+      </w:r>
+    </w:p>
+    <w:p>
+      <w:pPr>
+        <w:spacing w:after="160" w:before="240" w:line="360" w:lineRule="auto"/>
+        <w:jc w:val="both"/>
+      </w:pPr>
+      <w:r>
+        <w:rPr>
+          <w:rFonts w:ascii="Times New Roman" w:cs="Times New Roman" w:eastAsia="Times New Roman" w:hAnsi="Times New Roman"/>
+          <w:b/>
+          <w:bCs/>
+          <w:i w:val="false"/>
+          <w:iCs w:val="false"/>
+          <w:sz w:val="24"/>
+          <w:szCs w:val="24"/>
+        </w:rPr>
+        <w:t xml:space="preserve">Les règles de séparation</w:t>
+      </w:r>
+    </w:p>
+    <w:p>
+      <w:pPr>
+        <w:pStyle w:val="ListParagraph"/>
+        <w:numPr>
+          <w:ilvl w:val="0"/>
+          <w:numId w:val="2"/>
+        </w:numPr>
+        <w:spacing w:after="100" w:line="360" w:lineRule="auto"/>
+        <w:jc w:val="both"/>
+      </w:pPr>
+      <w:r>
+        <w:rPr>
+          <w:rFonts w:ascii="Times New Roman" w:cs="Times New Roman" w:eastAsia="Times New Roman" w:hAnsi="Times New Roman"/>
+          <w:sz w:val="24"/>
+          <w:szCs w:val="24"/>
+        </w:rPr>
+        <w:t xml:space="preserve">Aucune classe du paquet modele ne contient d'affichage ni de saisie.</w:t>
+      </w:r>
+    </w:p>
+    <w:p>
+      <w:pPr>
+        <w:pStyle w:val="ListParagraph"/>
+        <w:numPr>
+          <w:ilvl w:val="0"/>
+          <w:numId w:val="2"/>
+        </w:numPr>
+        <w:spacing w:after="100" w:line="360" w:lineRule="auto"/>
+        <w:jc w:val="both"/>
+      </w:pPr>
+      <w:r>
+        <w:rPr>
+          <w:rFonts w:ascii="Times New Roman" w:cs="Times New Roman" w:eastAsia="Times New Roman" w:hAnsi="Times New Roman"/>
+          <w:sz w:val="24"/>
+          <w:szCs w:val="24"/>
+        </w:rPr>
+        <w:t xml:space="preserve">Aucune classe du paquet vue n'importe un service.</w:t>
+      </w:r>
+    </w:p>
+    <w:p>
+      <w:pPr>
+        <w:pStyle w:val="ListParagraph"/>
+        <w:numPr>
+          <w:ilvl w:val="0"/>
+          <w:numId w:val="2"/>
+        </w:numPr>
+        <w:spacing w:after="100" w:line="360" w:lineRule="auto"/>
+        <w:jc w:val="both"/>
+      </w:pPr>
+      <w:r>
+        <w:rPr>
+          <w:rFonts w:ascii="Times New Roman" w:cs="Times New Roman" w:eastAsia="Times New Roman" w:hAnsi="Times New Roman"/>
+          <w:sz w:val="24"/>
+          <w:szCs w:val="24"/>
+        </w:rPr>
+        <w:t xml:space="preserve">Aucune classe du paquet modele n'importe une vue ou un contrôleur.</w:t>
+      </w:r>
+    </w:p>
+    <w:p>
+      <w:pPr>
+        <w:pStyle w:val="ListParagraph"/>
+        <w:numPr>
+          <w:ilvl w:val="0"/>
+          <w:numId w:val="2"/>
+        </w:numPr>
+        <w:spacing w:after="100" w:line="360" w:lineRule="auto"/>
+        <w:jc w:val="both"/>
+      </w:pPr>
+      <w:r>
+        <w:rPr>
+          <w:rFonts w:ascii="Times New Roman" w:cs="Times New Roman" w:eastAsia="Times New Roman" w:hAnsi="Times New Roman"/>
+          <w:sz w:val="24"/>
+          <w:szCs w:val="24"/>
+        </w:rPr>
+        <w:t xml:space="preserve">Le portefeuille n'est détenu que par ServicePortefeuille, qui l'expose aux autres services par une méthode à visibilité de paquet : les contrôleurs ne peuvent donc pas le manipuler directement.</w:t>
+      </w:r>
+    </w:p>
+    <w:p>
+      <w:pPr>
+        <w:pStyle w:val="ListParagraph"/>
+        <w:numPr>
+          <w:ilvl w:val="0"/>
+          <w:numId w:val="2"/>
+        </w:numPr>
+        <w:spacing w:after="100" w:line="360" w:lineRule="auto"/>
+        <w:jc w:val="both"/>
+      </w:pPr>
+      <w:r>
+        <w:rPr>
+          <w:rFonts w:ascii="Times New Roman" w:cs="Times New Roman" w:eastAsia="Times New Roman" w:hAnsi="Times New Roman"/>
+          <w:sz w:val="24"/>
+          <w:szCs w:val="24"/>
+        </w:rPr>
+        <w:t xml:space="preserve">La sauvegarde est déclenchée par les services après chaque opération validée, jamais par un contrôleur, et ServicePortefeuille en est le point unique.</w:t>
+      </w:r>
+    </w:p>
+    <w:p>
+      <w:pPr>
+        <w:spacing w:after="160" w:before="240" w:line="360" w:lineRule="auto"/>
+        <w:jc w:val="both"/>
+      </w:pPr>
+      <w:r>
+        <w:rPr>
+          <w:rFonts w:ascii="Times New Roman" w:cs="Times New Roman" w:eastAsia="Times New Roman" w:hAnsi="Times New Roman"/>
+          <w:b w:val="false"/>
+          <w:bCs w:val="false"/>
+          <w:i w:val="false"/>
+          <w:iCs w:val="false"/>
+          <w:sz w:val="24"/>
+          <w:szCs w:val="24"/>
+        </w:rPr>
+        <w:t xml:space="preserve">Ces contraintes permettront de remplacer la console par une interface graphique en réécrivant les vues et en adaptant les contrôleurs, sans modifier une seule règle métier.</w:t>
       </w:r>
     </w:p>
     <w:p>
@@ -4676,7 +5871,7 @@
                 <w:sz w:val="24"/>
                 <w:szCs w:val="24"/>
               </w:rPr>
-              <w:t xml:space="preserve">Classes de base : Transaction, Categorie, TypeTransaction, Portefeuille, et calcul du solde</w:t>
+              <w:t xml:space="preserve">Entités et énumérations, ServicePortefeuille et calcul du solde</w:t>
             </w:r>
           </w:p>
         </w:tc>
@@ -4730,7 +5925,7 @@
                 <w:sz w:val="24"/>
                 <w:szCs w:val="24"/>
               </w:rPr>
-              <w:t xml:space="preserve">Menu console, ajout et consultation des transactions</w:t>
+              <w:t xml:space="preserve">VueConsole, ControleurPrincipal, ServiceTransaction : ajout et consultation</w:t>
             </w:r>
           </w:p>
         </w:tc>
@@ -4784,7 +5979,7 @@
                 <w:sz w:val="24"/>
                 <w:szCs w:val="24"/>
               </w:rPr>
-              <w:t xml:space="preserve">Gestion des catégories actives, filtres, modification et suppression</w:t>
+              <w:t xml:space="preserve">ServiceCategorie, filtres, modification et suppression</w:t>
             </w:r>
           </w:p>
         </w:tc>
@@ -4838,7 +6033,7 @@
                 <w:sz w:val="24"/>
                 <w:szCs w:val="24"/>
               </w:rPr>
-              <w:t xml:space="preserve">Objectifs d'épargne et mouvements associés</w:t>
+              <w:t xml:space="preserve">Epargne, MouvementEpargne et ServiceEpargne</w:t>
             </w:r>
           </w:p>
         </w:tc>
@@ -4892,7 +6087,7 @@
                 <w:sz w:val="24"/>
                 <w:szCs w:val="24"/>
               </w:rPr>
-              <w:t xml:space="preserve">Persistance JSON avec Gson</w:t>
+              <w:t xml:space="preserve">GestionnaireFichier, adaptateur LocalDate, sauvegarde atomique</w:t>
             </w:r>
           </w:p>
         </w:tc>
@@ -4946,7 +6141,7 @@
                 <w:sz w:val="24"/>
                 <w:szCs w:val="24"/>
               </w:rPr>
-              <w:t xml:space="preserve">Statistiques et finitions</w:t>
+              <w:t xml:space="preserve">ServiceStatistique et finitions</w:t>
             </w:r>
           </w:p>
         </w:tc>

</xml_diff>

<commit_message>
refactor(persistance): supprime le stockage JSON et les orphelins post-migration
- retire GestionnaireFichier, gson-2.13.1.jar, IServicePortefeuille et les Tester*.java
- retire les trois methodes VueConsole liees a la boucle de reprise disparue
- retire sauvegarder(Portefeuille) de PortefeuilleRepository et GestionnairePostgreSQL,
  dernier orphelin, plus aucun appelant depuis le passage aux methodes granulaires
- retire portefeuille.json du .gitignore, ce fichier n'existe plus
- corrige les commentaires encore attribues a Gson/GestionnaireFichier/IServicePortefeuille
  (Portefeuille, Main, ServiceSolde, ControleurCategorie, GestionnairePostgreSQL,
  PortefeuilleRepository, ErreurChargementException)
- met a jour le README : dependances, compilation/lancement, donnees et arborescence
  pour PostgreSQL/Docker au lieu du stockage JSON
</commit_message>
<xml_diff>
--- a/docs/documentation_technique.docx
+++ b/docs/documentation_technique.docx
@@ -1103,7 +1103,7 @@
                 <w:sz w:val="24"/>
                 <w:szCs w:val="24"/>
               </w:rPr>
-              <w:t xml:space="preserve">Chaque opération est confirmée par l'utilisateur, puis les données sont sauvegardées automatiquement. Aucune sauvegarde manuelle n'est demandée.</w:t>
+              <w:t>Chaque opération est confirmée par l'utilisateur, puis écrite en base. L'écriture précède la mise à jour des données en mémoire : si elle échoue, rien n'a été modifié nulle part.</w:t>
             </w:r>
           </w:p>
         </w:tc>
@@ -2566,7 +2566,7 @@
           <w:sz w:val="24"/>
           <w:szCs w:val="24"/>
         </w:rPr>
-        <w:t xml:space="preserve">Le montant actuellement épargné n'est pas un champ stocké : il est calculé à partir des mouvements, en soustrayant les retraits des contributions. Cette solution garantit qu'il ne peut jamais être en contradiction avec l'historique.</w:t>
+        <w:t>Le montant actuellement épargné n'est pas un champ stocké : il est calculé à partir des mouvements, en soustrayant les retraits des contributions. Cette solution garantit qu'il ne peut jamais être en contradiction avec l'historique.</w:t>
       </w:r>
     </w:p>
     <w:p>
@@ -2977,7 +2977,7 @@
           <w:sz w:val="24"/>
           <w:szCs w:val="24"/>
         </w:rPr>
-        <w:t xml:space="preserve">Le portefeuille regroupe l'ensemble des données de l'utilisateur : la liste des transactions, la liste des catégories actives et la liste des objectifs d'épargne. Le solde disponible et le total épargné sont des valeurs calculées, jamais stockées.</w:t>
+        <w:t>Le portefeuille regroupe l'ensemble des données de l'utilisateur : la liste des transactions, la liste des catégories actives et la liste des objectifs d'épargne. Le solde disponible et le total épargné sont des valeurs calculées, jamais stockées. Les identifiants sont générés par la base de données au moment de l'insertion.</w:t>
       </w:r>
     </w:p>
     <w:p>
@@ -3246,7 +3246,7 @@
           <w:sz w:val="32"/>
           <w:szCs w:val="32"/>
         </w:rPr>
-        <w:t xml:space="preserve">6. Structure du fichier de sauvegarde</w:t>
+        <w:t>6. Schéma de la base de données</w:t>
       </w:r>
     </w:p>
     <w:p>
@@ -3264,7 +3264,7 @@
           <w:sz w:val="24"/>
           <w:szCs w:val="24"/>
         </w:rPr>
-        <w:t xml:space="preserve">Les données sont sérialisées avec Gson dans un fichier portefeuille.json, structuré comme suit :</w:t>
+        <w:t>Les données sont stockées dans une base PostgreSQL, accédée en JDBC. Chaque entité du diagramme de classes devient une table, et chaque composition une clé étrangère. Les identifiants sont générés par la base.</w:t>
       </w:r>
     </w:p>
     <w:p>
@@ -3278,7 +3278,7 @@
           <w:sz w:val="18"/>
           <w:szCs w:val="18"/>
         </w:rPr>
-        <w:t xml:space="preserve">{</w:t>
+        <w:t>CREATE TABLE transaction_financiere (</w:t>
       </w:r>
     </w:p>
     <w:p>
@@ -3292,7 +3292,7 @@
           <w:sz w:val="18"/>
           <w:szCs w:val="18"/>
         </w:rPr>
-        <w:t xml:space="preserve">  "categoriesActives": ["ALIMENTATION", "TRANSPORT", "SALAIRE"],</w:t>
+        <w:t xml:space="preserve">    id           SERIAL PRIMARY KEY,</w:t>
       </w:r>
     </w:p>
     <w:p>
@@ -3306,7 +3306,7 @@
           <w:sz w:val="18"/>
           <w:szCs w:val="18"/>
         </w:rPr>
-        <w:t xml:space="preserve">  "transactions": [</w:t>
+        <w:t xml:space="preserve">    montant      NUMERIC(12,2) NOT NULL CHECK (montant &gt; 0),</w:t>
       </w:r>
     </w:p>
     <w:p>
@@ -3320,7 +3320,7 @@
           <w:sz w:val="18"/>
           <w:szCs w:val="18"/>
         </w:rPr>
-        <w:t xml:space="preserve">    {</w:t>
+        <w:t xml:space="preserve">    type         VARCHAR(10) NOT NULL</w:t>
       </w:r>
     </w:p>
     <w:p>
@@ -3334,7 +3334,7 @@
           <w:sz w:val="18"/>
           <w:szCs w:val="18"/>
         </w:rPr>
-        <w:t xml:space="preserve">      "id": 1,</w:t>
+        <w:t xml:space="preserve">                 CHECK (type IN ('DEPENSE','REVENU')),</w:t>
       </w:r>
     </w:p>
     <w:p>
@@ -3348,7 +3348,7 @@
           <w:sz w:val="18"/>
           <w:szCs w:val="18"/>
         </w:rPr>
-        <w:t xml:space="preserve">      "montant": 15000.0,</w:t>
+        <w:t xml:space="preserve">    categorie    VARCHAR(30) NOT NULL,</w:t>
       </w:r>
     </w:p>
     <w:p>
@@ -3362,7 +3362,7 @@
           <w:sz w:val="18"/>
           <w:szCs w:val="18"/>
         </w:rPr>
-        <w:t xml:space="preserve">      "type": "DEPENSE",</w:t>
+        <w:t xml:space="preserve">    date_op      DATE NOT NULL CHECK (date_op &lt;= CURRENT_DATE),</w:t>
       </w:r>
     </w:p>
     <w:p>
@@ -3376,7 +3376,7 @@
           <w:sz w:val="18"/>
           <w:szCs w:val="18"/>
         </w:rPr>
-        <w:t xml:space="preserve">      "categorie": "ALIMENTATION",</w:t>
+        <w:t xml:space="preserve">    description  VARCHAR(255) NOT NULL DEFAULT ''</w:t>
       </w:r>
     </w:p>
     <w:p>
@@ -3390,7 +3390,7 @@
           <w:sz w:val="18"/>
           <w:szCs w:val="18"/>
         </w:rPr>
-        <w:t xml:space="preserve">      "date": "2026-08-10",</w:t>
+        <w:t>);</w:t>
       </w:r>
     </w:p>
     <w:p>
@@ -3404,7 +3404,6 @@
           <w:sz w:val="18"/>
           <w:szCs w:val="18"/>
         </w:rPr>
-        <w:t xml:space="preserve">      "description": "Courses de la semaine"</w:t>
       </w:r>
     </w:p>
     <w:p>
@@ -3418,7 +3417,7 @@
           <w:sz w:val="18"/>
           <w:szCs w:val="18"/>
         </w:rPr>
-        <w:t xml:space="preserve">    }</w:t>
+        <w:t>CREATE TABLE epargne (</w:t>
       </w:r>
     </w:p>
     <w:p>
@@ -3432,7 +3431,7 @@
           <w:sz w:val="18"/>
           <w:szCs w:val="18"/>
         </w:rPr>
-        <w:t xml:space="preserve">  ],</w:t>
+        <w:t xml:space="preserve">    id            SERIAL PRIMARY KEY,</w:t>
       </w:r>
     </w:p>
     <w:p>
@@ -3446,7 +3445,7 @@
           <w:sz w:val="18"/>
           <w:szCs w:val="18"/>
         </w:rPr>
-        <w:t xml:space="preserve">  "objectifs": [</w:t>
+        <w:t xml:space="preserve">    nom           VARCHAR(100) NOT NULL CHECK (nom &lt;&gt; ''),</w:t>
       </w:r>
     </w:p>
     <w:p>
@@ -3460,7 +3459,7 @@
           <w:sz w:val="18"/>
           <w:szCs w:val="18"/>
         </w:rPr>
-        <w:t xml:space="preserve">    {</w:t>
+        <w:t xml:space="preserve">    montant_cible NUMERIC(12,2) NOT NULL CHECK (montant_cible &gt; 0),</w:t>
       </w:r>
     </w:p>
     <w:p>
@@ -3474,7 +3473,7 @@
           <w:sz w:val="18"/>
           <w:szCs w:val="18"/>
         </w:rPr>
-        <w:t xml:space="preserve">      "id": 1,</w:t>
+        <w:t xml:space="preserve">    date_limite   DATE NULL</w:t>
       </w:r>
     </w:p>
     <w:p>
@@ -3488,7 +3487,7 @@
           <w:sz w:val="18"/>
           <w:szCs w:val="18"/>
         </w:rPr>
-        <w:t xml:space="preserve">      "nom": "Vacances",</w:t>
+        <w:t>);</w:t>
       </w:r>
     </w:p>
     <w:p>
@@ -3502,7 +3501,6 @@
           <w:sz w:val="18"/>
           <w:szCs w:val="18"/>
         </w:rPr>
-        <w:t xml:space="preserve">      "montantCible": 500000.0,</w:t>
       </w:r>
     </w:p>
     <w:p>
@@ -3516,7 +3514,7 @@
           <w:sz w:val="18"/>
           <w:szCs w:val="18"/>
         </w:rPr>
-        <w:t xml:space="preserve">      "dateLimite": "2026-12-01",</w:t>
+        <w:t>CREATE TABLE mouvement_epargne (</w:t>
       </w:r>
     </w:p>
     <w:p>
@@ -3530,7 +3528,7 @@
           <w:sz w:val="18"/>
           <w:szCs w:val="18"/>
         </w:rPr>
-        <w:t xml:space="preserve">      "mouvements": [</w:t>
+        <w:t xml:space="preserve">    id           SERIAL PRIMARY KEY,</w:t>
       </w:r>
     </w:p>
     <w:p>
@@ -3544,7 +3542,7 @@
           <w:sz w:val="18"/>
           <w:szCs w:val="18"/>
         </w:rPr>
-        <w:t xml:space="preserve">        { "montant": 120000.0, "sens": "CONTRIBUTION", "date": "2026-08-10" },</w:t>
+        <w:t xml:space="preserve">    objectif_id  INTEGER NOT NULL</w:t>
       </w:r>
     </w:p>
     <w:p>
@@ -3558,7 +3556,7 @@
           <w:sz w:val="18"/>
           <w:szCs w:val="18"/>
         </w:rPr>
-        <w:t xml:space="preserve">        { "montant": 20000.0, "sens": "RETRAIT", "date": "2026-08-12" }</w:t>
+        <w:t xml:space="preserve">                 REFERENCES epargne(id) ON DELETE CASCADE,</w:t>
       </w:r>
     </w:p>
     <w:p>
@@ -3572,7 +3570,7 @@
           <w:sz w:val="18"/>
           <w:szCs w:val="18"/>
         </w:rPr>
-        <w:t xml:space="preserve">      ]</w:t>
+        <w:t xml:space="preserve">    montant      NUMERIC(12,2) NOT NULL CHECK (montant &gt; 0),</w:t>
       </w:r>
     </w:p>
     <w:p>
@@ -3586,7 +3584,7 @@
           <w:sz w:val="18"/>
           <w:szCs w:val="18"/>
         </w:rPr>
-        <w:t xml:space="preserve">    }</w:t>
+        <w:t xml:space="preserve">    sens         VARCHAR(15) NOT NULL</w:t>
       </w:r>
     </w:p>
     <w:p>
@@ -3600,12 +3598,12 @@
           <w:sz w:val="18"/>
           <w:szCs w:val="18"/>
         </w:rPr>
-        <w:t xml:space="preserve">  ]</w:t>
-      </w:r>
-    </w:p>
-    <w:p>
-      <w:pPr>
-        <w:spacing w:after="200" w:before="0" w:line="240" w:lineRule="auto"/>
+        <w:t xml:space="preserve">                 CHECK (sens IN ('CONTRIBUTION','RETRAIT')),</w:t>
+      </w:r>
+    </w:p>
+    <w:p>
+      <w:pPr>
+        <w:spacing w:after="0" w:before="0" w:line="240" w:lineRule="auto"/>
         <w:ind w:left="400"/>
       </w:pPr>
       <w:r>
@@ -3614,7 +3612,123 @@
           <w:sz w:val="18"/>
           <w:szCs w:val="18"/>
         </w:rPr>
-        <w:t xml:space="preserve">}</w:t>
+        <w:t xml:space="preserve">    date_mvt     DATE NOT NULL CHECK (date_mvt &lt;= CURRENT_DATE)</w:t>
+      </w:r>
+    </w:p>
+    <w:p>
+      <w:pPr>
+        <w:spacing w:after="0" w:before="0" w:line="240" w:lineRule="auto"/>
+        <w:ind w:left="400"/>
+      </w:pPr>
+      <w:r>
+        <w:rPr>
+          <w:rFonts w:ascii="Courier New" w:cs="Courier New" w:eastAsia="Courier New" w:hAnsi="Courier New"/>
+          <w:sz w:val="18"/>
+          <w:szCs w:val="18"/>
+        </w:rPr>
+        <w:t>);</w:t>
+      </w:r>
+    </w:p>
+    <w:p>
+      <w:pPr>
+        <w:spacing w:after="200" w:before="200" w:line="240" w:lineRule="auto"/>
+        <w:ind w:left="400"/>
+      </w:pPr>
+      <w:r>
+        <w:rPr>
+          <w:rFonts w:ascii="Courier New" w:cs="Courier New" w:eastAsia="Courier New" w:hAnsi="Courier New"/>
+          <w:sz w:val="18"/>
+          <w:szCs w:val="18"/>
+        </w:rPr>
+        <w:t>CREATE TABLE categorie_active (</w:t>
+      </w:r>
+    </w:p>
+    <w:p>
+      <w:pPr>
+        <w:spacing w:after="0" w:before="0" w:line="240" w:lineRule="auto"/>
+        <w:ind w:left="400"/>
+      </w:pPr>
+      <w:r>
+        <w:rPr>
+          <w:rFonts w:ascii="Courier New" w:cs="Courier New" w:eastAsia="Courier New" w:hAnsi="Courier New"/>
+          <w:sz w:val="18"/>
+          <w:szCs w:val="18"/>
+        </w:rPr>
+        <w:t xml:space="preserve">    categorie VARCHAR(30) PRIMARY KEY</w:t>
+      </w:r>
+    </w:p>
+    <w:p>
+      <w:pPr>
+        <w:spacing w:after="200" w:before="0" w:line="240" w:lineRule="auto"/>
+        <w:ind w:left="400"/>
+      </w:pPr>
+      <w:r>
+        <w:rPr>
+          <w:rFonts w:ascii="Courier New" w:cs="Courier New" w:eastAsia="Courier New" w:hAnsi="Courier New"/>
+          <w:sz w:val="18"/>
+          <w:szCs w:val="18"/>
+        </w:rPr>
+        <w:t>);</w:t>
+      </w:r>
+    </w:p>
+    <w:p>
+      <w:pPr>
+        <w:spacing w:after="160" w:before="120" w:line="360" w:lineRule="auto"/>
+        <w:ind/>
+        <w:jc w:val="both"/>
+      </w:pPr>
+      <w:r>
+        <w:rPr>
+          <w:rFonts w:ascii="Times New Roman" w:cs="Courier New" w:eastAsia="Courier New" w:hAnsi="Times New Roman"/>
+          <w:sz w:val="24"/>
+          <w:szCs w:val="18"/>
+        </w:rPr>
+        <w:t>Trois choix méritent d'être justifiés.</w:t>
+      </w:r>
+    </w:p>
+    <w:p>
+      <w:pPr>
+        <w:spacing w:after="160" w:before="120" w:line="360" w:lineRule="auto"/>
+        <w:ind/>
+        <w:jc w:val="both"/>
+      </w:pPr>
+      <w:r>
+        <w:rPr>
+          <w:rFonts w:ascii="Times New Roman" w:cs="Courier New" w:eastAsia="Courier New" w:hAnsi="Times New Roman"/>
+          <w:sz w:val="24"/>
+          <w:szCs w:val="18"/>
+        </w:rPr>
+        <w:t>Il n'existe pas de table portefeuille. L'application ne gère qu'un seul portefeuille : une table à une seule ligne, référencée à l'identique sur chaque opération, n'apporterait rien et imposerait une jointure inutile à chaque requête.</w:t>
+      </w:r>
+    </w:p>
+    <w:p>
+      <w:pPr>
+        <w:spacing w:after="160" w:before="120" w:line="360" w:lineRule="auto"/>
+        <w:ind/>
+        <w:jc w:val="both"/>
+      </w:pPr>
+      <w:r>
+        <w:rPr>
+          <w:rFonts w:ascii="Times New Roman" w:cs="Courier New" w:eastAsia="Courier New" w:hAnsi="Times New Roman"/>
+          <w:sz w:val="24"/>
+          <w:szCs w:val="18"/>
+        </w:rPr>
+        <w:t>La colonne categorie de la table des opérations n'a pas de clé étrangère vers categorie_active. C'est délibéré : la règle de gestion veut qu'une désactivation reste sans effet sur les opérations déjà enregistrées. Une clé étrangère les invaliderait toutes dès la désactivation de leur catégorie. La table categorie_active exprime seulement quelles catégories sont actives en ce moment, la présence d'une ligne valant état actif.</w:t>
+      </w:r>
+    </w:p>
+    <w:p>
+      <w:pPr>
+        <w:spacing w:after="160" w:before="120" w:line="360" w:lineRule="auto"/>
+        <w:ind/>
+        <w:jc w:val="both"/>
+      </w:pPr>
+      <w:r>
+        <w:rPr>
+          <w:rFonts w:ascii="Times New Roman" w:cs="Courier New" w:eastAsia="Courier New" w:hAnsi="Times New Roman"/>
+          <w:sz w:val="24"/>
+          <w:szCs w:val="18"/>
+        </w:rPr>
+        <w:t>Les contraintes CHECK ne couvrent que les invariants portant sur une seule ligne : montant positif, date jamais future. Les règles qui font intervenir plusieurs lignes ou plusieurs tables, comme le refus d'une contribution supérieure au solde, restent dans les services. Les contraintes de la base servent de filet de sécurité, notamment pour une modification faite à la main depuis pgAdmin.</w:t>
       </w:r>
     </w:p>
     <w:p>
@@ -3649,7 +3763,7 @@
           <w:sz w:val="24"/>
           <w:szCs w:val="24"/>
         </w:rPr>
-        <w:t xml:space="preserve">L'application suit le modèle d'architecture MVC. Le code est réparti en trois paquets principaux : modele, vue et controleur, plus la classe Main à la racine.</w:t>
+        <w:t>L'application suit le modèle d'architecture MVC, organisé en couches. Le code est réparti en quatre paquets racines : presentation, application, domain et infrastructure, plus un paquet exception et la classe Main.</w:t>
       </w:r>
     </w:p>
     <w:p>
@@ -4187,7 +4301,7 @@
                 <w:sz w:val="24"/>
                 <w:szCs w:val="24"/>
               </w:rPr>
-              <w:t xml:space="preserve">Calcul du solde disponible et du total épargné, déclenchement de la sauvegarde ; seul détenteur du portefeuille</w:t>
+              <w:t>Détient le portefeuille en mémoire et relaie chaque opération vers le dépôt ; seul détenteur direct des données</w:t>
             </w:r>
           </w:p>
         </w:tc>
@@ -4485,7 +4599,7 @@
                 <w:sz w:val="24"/>
                 <w:szCs w:val="24"/>
               </w:rPr>
-              <w:t xml:space="preserve">GestionnaireFichier</w:t>
+              <w:t>GestionnairePostgreSQL</w:t>
             </w:r>
           </w:p>
         </w:tc>
@@ -4511,7 +4625,169 @@
                 <w:sz w:val="24"/>
                 <w:szCs w:val="24"/>
               </w:rPr>
-              <w:t xml:space="preserve">Lecture et écriture du fichier JSON via Gson</w:t>
+              <w:t>Implémentation de PortefeuilleRepository : lecture et écriture des quatre tables en JDBC, avec des requêtes préparées</w:t>
+            </w:r>
+          </w:p>
+        </w:tc>
+      </w:tr>
+      <w:tr>
+        <w:tc>
+          <w:tcPr>
+            <w:tcW w:type="dxa" w:w="2600"/>
+            <w:tcMar>
+              <w:top w:type="dxa" w:w="100"/>
+              <w:left w:type="dxa" w:w="120"/>
+              <w:bottom w:type="dxa" w:w="100"/>
+              <w:right w:type="dxa" w:w="120"/>
+            </w:tcMar>
+          </w:tcPr>
+          <w:p>
+            <w:pPr>
+              <w:spacing w:after="0" w:line="240" w:lineRule="auto"/>
+            </w:pPr>
+            <w:r>
+              <w:rPr>
+                <w:rFonts w:ascii="Times New Roman" w:cs="Times New Roman" w:eastAsia="Times New Roman" w:hAnsi="Times New Roman"/>
+                <w:b w:val="false"/>
+                <w:bCs w:val="false"/>
+                <w:sz w:val="24"/>
+                <w:szCs w:val="24"/>
+              </w:rPr>
+              <w:t>PortefeuilleRepository</w:t>
+            </w:r>
+          </w:p>
+        </w:tc>
+        <w:tc>
+          <w:tcPr>
+            <w:tcW w:type="dxa" w:w="6426"/>
+            <w:tcMar>
+              <w:top w:type="dxa" w:w="100"/>
+              <w:left w:type="dxa" w:w="120"/>
+              <w:bottom w:type="dxa" w:w="100"/>
+              <w:right w:type="dxa" w:w="120"/>
+            </w:tcMar>
+          </w:tcPr>
+          <w:p>
+            <w:pPr>
+              <w:spacing w:after="0" w:line="240" w:lineRule="auto"/>
+            </w:pPr>
+            <w:r>
+              <w:rPr>
+                <w:rFonts w:ascii="Times New Roman" w:cs="Times New Roman" w:eastAsia="Times New Roman" w:hAnsi="Times New Roman"/>
+                <w:b w:val="false"/>
+                <w:bCs w:val="false"/>
+                <w:sz w:val="24"/>
+                <w:szCs w:val="24"/>
+              </w:rPr>
+              <w:t>Interface de la persistance : le métier ignore comment les données sont stockées</w:t>
+            </w:r>
+          </w:p>
+        </w:tc>
+      </w:tr>
+      <w:tr>
+        <w:tc>
+          <w:tcPr>
+            <w:tcW w:type="dxa" w:w="2600"/>
+            <w:tcMar>
+              <w:top w:type="dxa" w:w="100"/>
+              <w:left w:type="dxa" w:w="120"/>
+              <w:bottom w:type="dxa" w:w="100"/>
+              <w:right w:type="dxa" w:w="120"/>
+            </w:tcMar>
+          </w:tcPr>
+          <w:p>
+            <w:pPr>
+              <w:spacing w:after="0" w:line="240" w:lineRule="auto"/>
+            </w:pPr>
+            <w:r>
+              <w:rPr>
+                <w:rFonts w:ascii="Times New Roman" w:cs="Times New Roman" w:eastAsia="Times New Roman" w:hAnsi="Times New Roman"/>
+                <w:b w:val="false"/>
+                <w:bCs w:val="false"/>
+                <w:sz w:val="24"/>
+                <w:szCs w:val="24"/>
+              </w:rPr>
+              <w:t>ConnexionBaseDeDonnees</w:t>
+            </w:r>
+          </w:p>
+        </w:tc>
+        <w:tc>
+          <w:tcPr>
+            <w:tcW w:type="dxa" w:w="6426"/>
+            <w:tcMar>
+              <w:top w:type="dxa" w:w="100"/>
+              <w:left w:type="dxa" w:w="120"/>
+              <w:bottom w:type="dxa" w:w="100"/>
+              <w:right w:type="dxa" w:w="120"/>
+            </w:tcMar>
+          </w:tcPr>
+          <w:p>
+            <w:pPr>
+              <w:spacing w:after="0" w:line="240" w:lineRule="auto"/>
+            </w:pPr>
+            <w:r>
+              <w:rPr>
+                <w:rFonts w:ascii="Times New Roman" w:cs="Times New Roman" w:eastAsia="Times New Roman" w:hAnsi="Times New Roman"/>
+                <w:b w:val="false"/>
+                <w:bCs w:val="false"/>
+                <w:sz w:val="24"/>
+                <w:szCs w:val="24"/>
+              </w:rPr>
+              <w:t>Ouvre la connexion JDBC à partir des paramètres lus dans un fichier non versionné</w:t>
+            </w:r>
+          </w:p>
+        </w:tc>
+      </w:tr>
+      <w:tr>
+        <w:tc>
+          <w:tcPr>
+            <w:tcW w:type="dxa" w:w="2600"/>
+            <w:tcMar>
+              <w:top w:type="dxa" w:w="100"/>
+              <w:left w:type="dxa" w:w="120"/>
+              <w:bottom w:type="dxa" w:w="100"/>
+              <w:right w:type="dxa" w:w="120"/>
+            </w:tcMar>
+          </w:tcPr>
+          <w:p>
+            <w:pPr>
+              <w:spacing w:after="0" w:line="240" w:lineRule="auto"/>
+            </w:pPr>
+            <w:r>
+              <w:rPr>
+                <w:rFonts w:ascii="Times New Roman" w:cs="Times New Roman" w:eastAsia="Times New Roman" w:hAnsi="Times New Roman"/>
+                <w:b w:val="false"/>
+                <w:bCs w:val="false"/>
+                <w:sz w:val="24"/>
+                <w:szCs w:val="24"/>
+              </w:rPr>
+              <w:t>ServiceSolde</w:t>
+            </w:r>
+          </w:p>
+        </w:tc>
+        <w:tc>
+          <w:tcPr>
+            <w:tcW w:type="dxa" w:w="6426"/>
+            <w:tcMar>
+              <w:top w:type="dxa" w:w="100"/>
+              <w:left w:type="dxa" w:w="120"/>
+              <w:bottom w:type="dxa" w:w="100"/>
+              <w:right w:type="dxa" w:w="120"/>
+            </w:tcMar>
+          </w:tcPr>
+          <w:p>
+            <w:pPr>
+              <w:spacing w:after="0" w:line="240" w:lineRule="auto"/>
+            </w:pPr>
+            <w:r>
+              <w:rPr>
+                <w:rFonts w:ascii="Times New Roman" w:cs="Times New Roman" w:eastAsia="Times New Roman" w:hAnsi="Times New Roman"/>
+                <w:b w:val="false"/>
+                <w:bCs w:val="false"/>
+                <w:sz w:val="24"/>
+                <w:szCs w:val="24"/>
+              </w:rPr>
+              <w:t>Calcule le solde disponible et le total épargné</w:t>
             </w:r>
           </w:p>
         </w:tc>
@@ -5081,7 +5357,7 @@
                 <w:sz w:val="24"/>
                 <w:szCs w:val="24"/>
               </w:rPr>
-              <w:t xml:space="preserve">ControleurPrincipal</w:t>
+              <w:t>ControleurPortefeuille</w:t>
             </w:r>
           </w:p>
         </w:tc>
@@ -5107,7 +5383,7 @@
                 <w:sz w:val="24"/>
                 <w:szCs w:val="24"/>
               </w:rPr>
-              <w:t xml:space="preserve">Boucle du menu principal et aiguillage vers les autres contrôleurs</w:t>
+              <w:t>Affichage du solde disponible et du total épargné</w:t>
             </w:r>
           </w:p>
         </w:tc>
@@ -5381,7 +5657,7 @@
           <w:sz w:val="24"/>
           <w:szCs w:val="24"/>
         </w:rPr>
-        <w:t xml:space="preserve">Aucune classe du paquet modele ne contient d'affichage ni de saisie.</w:t>
+        <w:t>Aucune classe de domain, application ou infrastructure ne contient d'affichage ni de saisie.</w:t>
       </w:r>
     </w:p>
     <w:p>
@@ -5400,7 +5676,7 @@
           <w:sz w:val="24"/>
           <w:szCs w:val="24"/>
         </w:rPr>
-        <w:t xml:space="preserve">Aucune classe du paquet vue n'importe un service.</w:t>
+        <w:t>Aucune classe du paquet presentation.view n'importe une implémentation de service.</w:t>
       </w:r>
     </w:p>
     <w:p>
@@ -5419,7 +5695,7 @@
           <w:sz w:val="24"/>
           <w:szCs w:val="24"/>
         </w:rPr>
-        <w:t xml:space="preserve">Aucune classe du paquet modele n'importe une vue ou un contrôleur.</w:t>
+        <w:t>Aucune classe de domain, application ou infrastructure n'importe une vue ou un contrôleur.</w:t>
       </w:r>
     </w:p>
     <w:p>
@@ -5438,7 +5714,7 @@
           <w:sz w:val="24"/>
           <w:szCs w:val="24"/>
         </w:rPr>
-        <w:t xml:space="preserve">Le portefeuille n'est détenu que par ServicePortefeuille, qui l'expose aux autres services par une méthode à visibilité de paquet : les contrôleurs ne peuvent donc pas le manipuler directement.</w:t>
+        <w:t>Le portefeuille n'est détenu que par ServicePortefeuille, qui l'expose aux autres services par une méthode à visibilité de paquet : les contrôleurs ne peuvent pas le manipuler.</w:t>
       </w:r>
     </w:p>
     <w:p>
@@ -5457,185 +5733,7 @@
           <w:sz w:val="24"/>
           <w:szCs w:val="24"/>
         </w:rPr>
-        <w:t xml:space="preserve">La sauvegarde est déclenchée par les services après chaque opération validée, jamais par un contrôleur, et ServicePortefeuille en est le point unique.</w:t>
-      </w:r>
-    </w:p>
-    <w:p>
-      <w:pPr>
-        <w:spacing w:after="160" w:before="240" w:line="360" w:lineRule="auto"/>
-        <w:jc w:val="both"/>
-      </w:pPr>
-      <w:r>
-        <w:rPr>
-          <w:rFonts w:ascii="Times New Roman" w:cs="Times New Roman" w:eastAsia="Times New Roman" w:hAnsi="Times New Roman"/>
-          <w:b w:val="false"/>
-          <w:bCs w:val="false"/>
-          <w:i w:val="false"/>
-          <w:iCs w:val="false"/>
-          <w:sz w:val="24"/>
-          <w:szCs w:val="24"/>
-        </w:rPr>
-        <w:t xml:space="preserve">Ces contraintes permettront de remplacer la console par une interface graphique en réécrivant les vues et en adaptant les contrôleurs, sans modifier une seule règle métier.</w:t>
-      </w:r>
-    </w:p>
-    <w:p>
-      <w:pPr>
-        <w:pStyle w:val="Heading1"/>
-        <w:spacing w:after="200" w:before="320" w:line="360" w:lineRule="auto"/>
-      </w:pPr>
-      <w:r>
-        <w:rPr>
-          <w:rFonts w:ascii="Times New Roman" w:cs="Times New Roman" w:eastAsia="Times New Roman" w:hAnsi="Times New Roman"/>
-          <w:b/>
-          <w:bCs/>
-          <w:color w:val="000000"/>
-          <w:sz w:val="32"/>
-          <w:szCs w:val="32"/>
-        </w:rPr>
-        <w:t xml:space="preserve">8. Menu console</w:t>
-      </w:r>
-    </w:p>
-    <w:p>
-      <w:pPr>
-        <w:spacing w:after="0" w:before="120" w:line="240" w:lineRule="auto"/>
-        <w:ind w:left="400"/>
-      </w:pPr>
-      <w:r>
-        <w:rPr>
-          <w:rFonts w:ascii="Courier New" w:cs="Courier New" w:eastAsia="Courier New" w:hAnsi="Courier New"/>
-          <w:sz w:val="18"/>
-          <w:szCs w:val="18"/>
-        </w:rPr>
-        <w:t xml:space="preserve">=== GESTION DE PORTE-MONNAIE ===</w:t>
-      </w:r>
-    </w:p>
-    <w:p>
-      <w:pPr>
-        <w:spacing w:after="0" w:before="0" w:line="240" w:lineRule="auto"/>
-        <w:ind w:left="400"/>
-      </w:pPr>
-      <w:r>
-        <w:rPr>
-          <w:rFonts w:ascii="Courier New" w:cs="Courier New" w:eastAsia="Courier New" w:hAnsi="Courier New"/>
-          <w:sz w:val="18"/>
-          <w:szCs w:val="18"/>
-        </w:rPr>
-        <w:t xml:space="preserve">1. Voir le solde</w:t>
-      </w:r>
-    </w:p>
-    <w:p>
-      <w:pPr>
-        <w:spacing w:after="0" w:before="0" w:line="240" w:lineRule="auto"/>
-        <w:ind w:left="400"/>
-      </w:pPr>
-      <w:r>
-        <w:rPr>
-          <w:rFonts w:ascii="Courier New" w:cs="Courier New" w:eastAsia="Courier New" w:hAnsi="Courier New"/>
-          <w:sz w:val="18"/>
-          <w:szCs w:val="18"/>
-        </w:rPr>
-        <w:t xml:space="preserve">2. Ajouter une dépense</w:t>
-      </w:r>
-    </w:p>
-    <w:p>
-      <w:pPr>
-        <w:spacing w:after="0" w:before="0" w:line="240" w:lineRule="auto"/>
-        <w:ind w:left="400"/>
-      </w:pPr>
-      <w:r>
-        <w:rPr>
-          <w:rFonts w:ascii="Courier New" w:cs="Courier New" w:eastAsia="Courier New" w:hAnsi="Courier New"/>
-          <w:sz w:val="18"/>
-          <w:szCs w:val="18"/>
-        </w:rPr>
-        <w:t xml:space="preserve">3. Ajouter un revenu</w:t>
-      </w:r>
-    </w:p>
-    <w:p>
-      <w:pPr>
-        <w:spacing w:after="0" w:before="0" w:line="240" w:lineRule="auto"/>
-        <w:ind w:left="400"/>
-      </w:pPr>
-      <w:r>
-        <w:rPr>
-          <w:rFonts w:ascii="Courier New" w:cs="Courier New" w:eastAsia="Courier New" w:hAnsi="Courier New"/>
-          <w:sz w:val="18"/>
-          <w:szCs w:val="18"/>
-        </w:rPr>
-        <w:t xml:space="preserve">4. Voir l'historique des transactions</w:t>
-      </w:r>
-    </w:p>
-    <w:p>
-      <w:pPr>
-        <w:spacing w:after="0" w:before="0" w:line="240" w:lineRule="auto"/>
-        <w:ind w:left="400"/>
-      </w:pPr>
-      <w:r>
-        <w:rPr>
-          <w:rFonts w:ascii="Courier New" w:cs="Courier New" w:eastAsia="Courier New" w:hAnsi="Courier New"/>
-          <w:sz w:val="18"/>
-          <w:szCs w:val="18"/>
-        </w:rPr>
-        <w:t xml:space="preserve">5. Gérer mes objectifs d'épargne</w:t>
-      </w:r>
-    </w:p>
-    <w:p>
-      <w:pPr>
-        <w:spacing w:after="0" w:before="0" w:line="240" w:lineRule="auto"/>
-        <w:ind w:left="400"/>
-      </w:pPr>
-      <w:r>
-        <w:rPr>
-          <w:rFonts w:ascii="Courier New" w:cs="Courier New" w:eastAsia="Courier New" w:hAnsi="Courier New"/>
-          <w:sz w:val="18"/>
-          <w:szCs w:val="18"/>
-        </w:rPr>
-        <w:t xml:space="preserve">6. Gérer mes catégories</w:t>
-      </w:r>
-    </w:p>
-    <w:p>
-      <w:pPr>
-        <w:spacing w:after="0" w:before="0" w:line="240" w:lineRule="auto"/>
-        <w:ind w:left="400"/>
-      </w:pPr>
-      <w:r>
-        <w:rPr>
-          <w:rFonts w:ascii="Courier New" w:cs="Courier New" w:eastAsia="Courier New" w:hAnsi="Courier New"/>
-          <w:sz w:val="18"/>
-          <w:szCs w:val="18"/>
-        </w:rPr>
-        <w:t xml:space="preserve">7. Voir les statistiques</w:t>
-      </w:r>
-    </w:p>
-    <w:p>
-      <w:pPr>
-        <w:spacing w:after="200" w:before="0" w:line="240" w:lineRule="auto"/>
-        <w:ind w:left="400"/>
-      </w:pPr>
-      <w:r>
-        <w:rPr>
-          <w:rFonts w:ascii="Courier New" w:cs="Courier New" w:eastAsia="Courier New" w:hAnsi="Courier New"/>
-          <w:sz w:val="18"/>
-          <w:szCs w:val="18"/>
-        </w:rPr>
-        <w:t xml:space="preserve">8. Quitter</w:t>
-      </w:r>
-    </w:p>
-    <w:p>
-      <w:pPr>
-        <w:pStyle w:val="Heading1"/>
-        <w:spacing w:after="200" w:before="320" w:line="360" w:lineRule="auto"/>
-      </w:pPr>
-      <w:r>
-        <w:rPr>
-          <w:rFonts w:ascii="Times New Roman" w:cs="Times New Roman" w:eastAsia="Times New Roman" w:hAnsi="Times New Roman"/>
-          <w:b/>
-          <w:bCs/>
-          <w:color w:val="000000"/>
-          <w:sz w:val="32"/>
-          <w:szCs w:val="32"/>
-        </w:rPr>
-        <w:t xml:space="preserve">9. Dépendances techniques</w:t>
+        <w:t>La persistance est déclenchée par les services après chaque opération validée, jamais par un contrôleur, et toujours à travers l'interface PortefeuilleRepository.</w:t>
       </w:r>
     </w:p>
     <w:p>
@@ -5654,7 +5752,185 @@
           <w:sz w:val="24"/>
           <w:szCs w:val="24"/>
         </w:rPr>
-        <w:t xml:space="preserve">Java, dernière version stable du JDK.</w:t>
+        <w:t>Les contrôleurs n'enchaînent que des appels : aucun calcul, aucune boucle sur des données, aucune chaîne de caractères destinée à l'utilisateur.</w:t>
+      </w:r>
+    </w:p>
+    <w:p>
+      <w:pPr>
+        <w:spacing w:after="160" w:before="240" w:line="360" w:lineRule="auto"/>
+        <w:jc w:val="both"/>
+      </w:pPr>
+      <w:r>
+        <w:rPr>
+          <w:rFonts w:ascii="Times New Roman" w:cs="Times New Roman" w:eastAsia="Times New Roman" w:hAnsi="Times New Roman"/>
+          <w:b w:val="false"/>
+          <w:bCs w:val="false"/>
+          <w:i w:val="false"/>
+          <w:iCs w:val="false"/>
+          <w:sz w:val="24"/>
+          <w:szCs w:val="24"/>
+        </w:rPr>
+        <w:t>Ces contraintes permettent de remplacer la console par une interface graphique en réécrivant les vues et en adaptant les contrôleurs, sans modifier une seule règle métier. De la même manière, le passage du fichier JSON à PostgreSQL n'a touché que la couche infrastructure.</w:t>
+      </w:r>
+    </w:p>
+    <w:p>
+      <w:pPr>
+        <w:pStyle w:val="Heading1"/>
+        <w:spacing w:after="200" w:before="320" w:line="360" w:lineRule="auto"/>
+      </w:pPr>
+      <w:r>
+        <w:rPr>
+          <w:rFonts w:ascii="Times New Roman" w:cs="Times New Roman" w:eastAsia="Times New Roman" w:hAnsi="Times New Roman"/>
+          <w:b/>
+          <w:bCs/>
+          <w:color w:val="000000"/>
+          <w:sz w:val="32"/>
+          <w:szCs w:val="32"/>
+        </w:rPr>
+        <w:t xml:space="preserve">8. Menu console</w:t>
+      </w:r>
+    </w:p>
+    <w:p>
+      <w:pPr>
+        <w:spacing w:after="0" w:before="120" w:line="240" w:lineRule="auto"/>
+        <w:ind w:left="400"/>
+      </w:pPr>
+      <w:r>
+        <w:rPr>
+          <w:rFonts w:ascii="Courier New" w:cs="Courier New" w:eastAsia="Courier New" w:hAnsi="Courier New"/>
+          <w:sz w:val="18"/>
+          <w:szCs w:val="18"/>
+        </w:rPr>
+        <w:t xml:space="preserve">=== GESTION DE PORTE-MONNAIE ===</w:t>
+      </w:r>
+    </w:p>
+    <w:p>
+      <w:pPr>
+        <w:spacing w:after="0" w:before="0" w:line="240" w:lineRule="auto"/>
+        <w:ind w:left="400"/>
+      </w:pPr>
+      <w:r>
+        <w:rPr>
+          <w:rFonts w:ascii="Courier New" w:cs="Courier New" w:eastAsia="Courier New" w:hAnsi="Courier New"/>
+          <w:sz w:val="18"/>
+          <w:szCs w:val="18"/>
+        </w:rPr>
+        <w:t xml:space="preserve">1. Voir le solde</w:t>
+      </w:r>
+    </w:p>
+    <w:p>
+      <w:pPr>
+        <w:spacing w:after="0" w:before="0" w:line="240" w:lineRule="auto"/>
+        <w:ind w:left="400"/>
+      </w:pPr>
+      <w:r>
+        <w:rPr>
+          <w:rFonts w:ascii="Courier New" w:cs="Courier New" w:eastAsia="Courier New" w:hAnsi="Courier New"/>
+          <w:sz w:val="18"/>
+          <w:szCs w:val="18"/>
+        </w:rPr>
+        <w:t xml:space="preserve">2. Ajouter une dépense</w:t>
+      </w:r>
+    </w:p>
+    <w:p>
+      <w:pPr>
+        <w:spacing w:after="0" w:before="0" w:line="240" w:lineRule="auto"/>
+        <w:ind w:left="400"/>
+      </w:pPr>
+      <w:r>
+        <w:rPr>
+          <w:rFonts w:ascii="Courier New" w:cs="Courier New" w:eastAsia="Courier New" w:hAnsi="Courier New"/>
+          <w:sz w:val="18"/>
+          <w:szCs w:val="18"/>
+        </w:rPr>
+        <w:t xml:space="preserve">3. Ajouter un revenu</w:t>
+      </w:r>
+    </w:p>
+    <w:p>
+      <w:pPr>
+        <w:spacing w:after="0" w:before="0" w:line="240" w:lineRule="auto"/>
+        <w:ind w:left="400"/>
+      </w:pPr>
+      <w:r>
+        <w:rPr>
+          <w:rFonts w:ascii="Courier New" w:cs="Courier New" w:eastAsia="Courier New" w:hAnsi="Courier New"/>
+          <w:sz w:val="18"/>
+          <w:szCs w:val="18"/>
+        </w:rPr>
+        <w:t xml:space="preserve">4. Voir l'historique des transactions</w:t>
+      </w:r>
+    </w:p>
+    <w:p>
+      <w:pPr>
+        <w:spacing w:after="0" w:before="0" w:line="240" w:lineRule="auto"/>
+        <w:ind w:left="400"/>
+      </w:pPr>
+      <w:r>
+        <w:rPr>
+          <w:rFonts w:ascii="Courier New" w:cs="Courier New" w:eastAsia="Courier New" w:hAnsi="Courier New"/>
+          <w:sz w:val="18"/>
+          <w:szCs w:val="18"/>
+        </w:rPr>
+        <w:t xml:space="preserve">5. Gérer mes objectifs d'épargne</w:t>
+      </w:r>
+    </w:p>
+    <w:p>
+      <w:pPr>
+        <w:spacing w:after="0" w:before="0" w:line="240" w:lineRule="auto"/>
+        <w:ind w:left="400"/>
+      </w:pPr>
+      <w:r>
+        <w:rPr>
+          <w:rFonts w:ascii="Courier New" w:cs="Courier New" w:eastAsia="Courier New" w:hAnsi="Courier New"/>
+          <w:sz w:val="18"/>
+          <w:szCs w:val="18"/>
+        </w:rPr>
+        <w:t xml:space="preserve">6. Gérer mes catégories</w:t>
+      </w:r>
+    </w:p>
+    <w:p>
+      <w:pPr>
+        <w:spacing w:after="0" w:before="0" w:line="240" w:lineRule="auto"/>
+        <w:ind w:left="400"/>
+      </w:pPr>
+      <w:r>
+        <w:rPr>
+          <w:rFonts w:ascii="Courier New" w:cs="Courier New" w:eastAsia="Courier New" w:hAnsi="Courier New"/>
+          <w:sz w:val="18"/>
+          <w:szCs w:val="18"/>
+        </w:rPr>
+        <w:t xml:space="preserve">7. Voir les statistiques</w:t>
+      </w:r>
+    </w:p>
+    <w:p>
+      <w:pPr>
+        <w:spacing w:after="200" w:before="0" w:line="240" w:lineRule="auto"/>
+        <w:ind w:left="400"/>
+      </w:pPr>
+      <w:r>
+        <w:rPr>
+          <w:rFonts w:ascii="Courier New" w:cs="Courier New" w:eastAsia="Courier New" w:hAnsi="Courier New"/>
+          <w:sz w:val="18"/>
+          <w:szCs w:val="18"/>
+        </w:rPr>
+        <w:t xml:space="preserve">8. Quitter</w:t>
+      </w:r>
+    </w:p>
+    <w:p>
+      <w:pPr>
+        <w:pStyle w:val="Heading1"/>
+        <w:spacing w:after="200" w:before="320" w:line="360" w:lineRule="auto"/>
+      </w:pPr>
+      <w:r>
+        <w:rPr>
+          <w:rFonts w:ascii="Times New Roman" w:cs="Times New Roman" w:eastAsia="Times New Roman" w:hAnsi="Times New Roman"/>
+          <w:b/>
+          <w:bCs/>
+          <w:color w:val="000000"/>
+          <w:sz w:val="32"/>
+          <w:szCs w:val="32"/>
+        </w:rPr>
+        <w:t xml:space="preserve">9. Dépendances techniques</w:t>
       </w:r>
     </w:p>
     <w:p>
@@ -5673,7 +5949,7 @@
           <w:sz w:val="24"/>
           <w:szCs w:val="24"/>
         </w:rPr>
-        <w:t xml:space="preserve">Gson, pour la sérialisation et la désérialisation JSON.</w:t>
+        <w:t>Java, dernière version stable du JDK, et le pilote JDBC PostgreSQL, seule bibliothèque externe du projet. Aucun ORM : les requêtes SQL sont écrites à la main, avec des requêtes préparées.</w:t>
       </w:r>
     </w:p>
     <w:p>
@@ -5692,7 +5968,7 @@
           <w:sz w:val="24"/>
           <w:szCs w:val="24"/>
         </w:rPr>
-        <w:t xml:space="preserve">Visual Studio Code comme environnement de développement.</w:t>
+        <w:t>PostgreSQL, exécuté dans un conteneur Docker à partir de l'image officielle.</w:t>
       </w:r>
     </w:p>
     <w:p>
@@ -5711,7 +5987,7 @@
           <w:sz w:val="24"/>
           <w:szCs w:val="24"/>
         </w:rPr>
-        <w:t xml:space="preserve">Git pour la gestion de versions.</w:t>
+        <w:t>Visual Studio Code comme environnement de développement ; l'application Java est lancée depuis la machine et se connecte à la base conteneurisée.</w:t>
       </w:r>
     </w:p>
     <w:p>
@@ -5730,7 +6006,26 @@
           <w:sz w:val="24"/>
           <w:szCs w:val="24"/>
         </w:rPr>
-        <w:t xml:space="preserve">Aucune base de données : la persistance repose sur un fichier JSON local.</w:t>
+        <w:t>Git pour la gestion de versions, Docker Compose pour l'orchestration des conteneurs.</w:t>
+      </w:r>
+    </w:p>
+    <w:p>
+      <w:pPr>
+        <w:pStyle w:val="ListParagraph"/>
+        <w:numPr>
+          <w:ilvl w:val="0"/>
+          <w:numId w:val="2"/>
+        </w:numPr>
+        <w:spacing w:after="100" w:line="360" w:lineRule="auto"/>
+        <w:jc w:val="both"/>
+      </w:pPr>
+      <w:r>
+        <w:rPr>
+          <w:rFonts w:ascii="Times New Roman" w:cs="Times New Roman" w:eastAsia="Times New Roman" w:hAnsi="Times New Roman"/>
+          <w:sz w:val="24"/>
+          <w:szCs w:val="24"/>
+        </w:rPr>
+        <w:t>pgAdmin, également conteneurisé, pour consulter et administrer la base.</w:t>
       </w:r>
     </w:p>
     <w:p>
@@ -5845,7 +6140,7 @@
                 <w:sz w:val="24"/>
                 <w:szCs w:val="24"/>
               </w:rPr>
-              <w:t xml:space="preserve">1</w:t>
+              <w:t>1</w:t>
             </w:r>
           </w:p>
         </w:tc>
@@ -5871,7 +6166,7 @@
                 <w:sz w:val="24"/>
                 <w:szCs w:val="24"/>
               </w:rPr>
-              <w:t xml:space="preserve">Entités et énumérations, ServicePortefeuille et calcul du solde</w:t>
+              <w:t>Entités, énumérations et calcul du solde</w:t>
             </w:r>
           </w:p>
         </w:tc>
@@ -5899,7 +6194,7 @@
                 <w:sz w:val="24"/>
                 <w:szCs w:val="24"/>
               </w:rPr>
-              <w:t xml:space="preserve">2</w:t>
+              <w:t>2</w:t>
             </w:r>
           </w:p>
         </w:tc>
@@ -5925,7 +6220,7 @@
                 <w:sz w:val="24"/>
                 <w:szCs w:val="24"/>
               </w:rPr>
-              <w:t xml:space="preserve">VueConsole, ControleurPrincipal, ServiceTransaction : ajout et consultation</w:t>
+              <w:t>Vues, contrôleurs, ajout et consultation des opérations</w:t>
             </w:r>
           </w:p>
         </w:tc>
@@ -5953,7 +6248,7 @@
                 <w:sz w:val="24"/>
                 <w:szCs w:val="24"/>
               </w:rPr>
-              <w:t xml:space="preserve">3</w:t>
+              <w:t>3</w:t>
             </w:r>
           </w:p>
         </w:tc>
@@ -5979,7 +6274,7 @@
                 <w:sz w:val="24"/>
                 <w:szCs w:val="24"/>
               </w:rPr>
-              <w:t xml:space="preserve">ServiceCategorie, filtres, modification et suppression</w:t>
+              <w:t>Catégories actives, filtres, modification et suppression</w:t>
             </w:r>
           </w:p>
         </w:tc>
@@ -6007,7 +6302,7 @@
                 <w:sz w:val="24"/>
                 <w:szCs w:val="24"/>
               </w:rPr>
-              <w:t xml:space="preserve">4</w:t>
+              <w:t>4</w:t>
             </w:r>
           </w:p>
         </w:tc>
@@ -6033,7 +6328,7 @@
                 <w:sz w:val="24"/>
                 <w:szCs w:val="24"/>
               </w:rPr>
-              <w:t xml:space="preserve">Epargne, MouvementEpargne et ServiceEpargne</w:t>
+              <w:t>Objectifs d'épargne et mouvements associés</w:t>
             </w:r>
           </w:p>
         </w:tc>
@@ -6061,7 +6356,7 @@
                 <w:sz w:val="24"/>
                 <w:szCs w:val="24"/>
               </w:rPr>
-              <w:t xml:space="preserve">5</w:t>
+              <w:t>5</w:t>
             </w:r>
           </w:p>
         </w:tc>
@@ -6087,7 +6382,7 @@
                 <w:sz w:val="24"/>
                 <w:szCs w:val="24"/>
               </w:rPr>
-              <w:t xml:space="preserve">GestionnaireFichier, adaptateur LocalDate, sauvegarde atomique</w:t>
+              <w:t>Statistiques</w:t>
             </w:r>
           </w:p>
         </w:tc>
@@ -6115,7 +6410,7 @@
                 <w:sz w:val="24"/>
                 <w:szCs w:val="24"/>
               </w:rPr>
-              <w:t xml:space="preserve">6</w:t>
+              <w:t>6</w:t>
             </w:r>
           </w:p>
         </w:tc>
@@ -6141,7 +6436,61 @@
                 <w:sz w:val="24"/>
                 <w:szCs w:val="24"/>
               </w:rPr>
-              <w:t xml:space="preserve">ServiceStatistique et finitions</w:t>
+              <w:t>Passage à une architecture en couches : services, interfaces, DTO</w:t>
+            </w:r>
+          </w:p>
+        </w:tc>
+      </w:tr>
+      <w:tr>
+        <w:tc>
+          <w:tcPr>
+            <w:tcW w:type="dxa" w:w="1400"/>
+            <w:tcMar>
+              <w:top w:type="dxa" w:w="100"/>
+              <w:left w:type="dxa" w:w="120"/>
+              <w:bottom w:type="dxa" w:w="100"/>
+              <w:right w:type="dxa" w:w="120"/>
+            </w:tcMar>
+          </w:tcPr>
+          <w:p>
+            <w:pPr>
+              <w:spacing w:after="0" w:line="240" w:lineRule="auto"/>
+            </w:pPr>
+            <w:r>
+              <w:rPr>
+                <w:rFonts w:ascii="Times New Roman" w:cs="Times New Roman" w:eastAsia="Times New Roman" w:hAnsi="Times New Roman"/>
+                <w:b w:val="false"/>
+                <w:bCs w:val="false"/>
+                <w:sz w:val="24"/>
+                <w:szCs w:val="24"/>
+              </w:rPr>
+              <w:t>7</w:t>
+            </w:r>
+          </w:p>
+        </w:tc>
+        <w:tc>
+          <w:tcPr>
+            <w:tcW w:type="dxa" w:w="7626"/>
+            <w:tcMar>
+              <w:top w:type="dxa" w:w="100"/>
+              <w:left w:type="dxa" w:w="120"/>
+              <w:bottom w:type="dxa" w:w="100"/>
+              <w:right w:type="dxa" w:w="120"/>
+            </w:tcMar>
+          </w:tcPr>
+          <w:p>
+            <w:pPr>
+              <w:spacing w:after="0" w:line="240" w:lineRule="auto"/>
+            </w:pPr>
+            <w:r>
+              <w:rPr>
+                <w:rFonts w:ascii="Times New Roman" w:cs="Times New Roman" w:eastAsia="Times New Roman" w:hAnsi="Times New Roman"/>
+                <w:b w:val="false"/>
+                <w:bCs w:val="false"/>
+                <w:sz w:val="24"/>
+                <w:szCs w:val="24"/>
+              </w:rPr>
+              <w:t>Passage à PostgreSQL en JDBC et conteneurisation avec Docker</w:t>
             </w:r>
           </w:p>
         </w:tc>

</xml_diff>